<commit_message>
may fixes, ustav updates
</commit_message>
<xml_diff>
--- a/flow/20230927_hours/drafts/2026-04-g/12.04.docx
+++ b/flow/20230927_hours/drafts/2026-04-g/12.04.docx
@@ -1214,7 +1214,317 @@
           <w:color w:val="000000"/>
           <w:sz w:val="24"/>
         </w:rPr>
-        <w:t xml:space="preserve">Хоч </w:t>
+        <w:t>Хоч запеча́таний був гріб,* як життя́ із гро́бу возсія́в Ти, Хри́сте Бо́же,* і, хоч за́мкнені були́ две́рі,* ученика́м предста́в єси́, як воскресі́ння всіх,* дух пра́вий че́рез них обно́влюючи нам,* по вели́кій Твої́й ми́лості.</w:t>
+      </w:r>
+    </w:p>
+    <w:p>
+      <w:pPr>
+        <w:spacing w:line="240" w:lineRule="auto"/>
+        <w:rPr>
+          <w:rFonts w:ascii="Times New Roman" w:hAnsi="Times New Roman"/>
+          <w:sz w:val="24"/>
+        </w:rPr>
+      </w:pPr>
+      <w:r>
+        <w:rPr>
+          <w:rFonts w:ascii="Times New Roman" w:hAnsi="Times New Roman"/>
+          <w:sz w:val="24"/>
+        </w:rPr>
+        <w:t>І нині, і повсякчас, і на віки вічні. Амінь.</w:t>
+      </w:r>
+    </w:p>
+    <w:p>
+      <w:pPr>
+        <w:spacing w:line="240" w:lineRule="auto"/>
+        <w:rPr>
+          <w:rFonts w:ascii="Times New Roman" w:hAnsi="Times New Roman"/>
+          <w:sz w:val="24"/>
+        </w:rPr>
+      </w:pPr>
+      <w:r>
+        <w:rPr>
+          <w:rFonts w:ascii="Times New Roman" w:hAnsi="Times New Roman"/>
+          <w:sz w:val="24"/>
+        </w:rPr>
+        <w:t>Як нам називати тебе, Благодатна?* Небом? – Ти бо випромінила Сонце Правди.* Раєм? Ти бо виростила нам Квіт нетління.* Дівою – Ти бо зосталася нетлінна.* Чистою Матір'ю? – Ти бо носила у святих обіймах твоїх Сина, всіх Бога.* Його ж моли, щоб спас душі наші.</w:t>
+      </w:r>
+    </w:p>
+    <w:p>
+      <w:pPr>
+        <w:spacing w:line="240" w:lineRule="auto"/>
+        <w:jc w:val="center"/>
+        <w:rPr>
+          <w:rFonts w:ascii="Times New Roman" w:hAnsi="Times New Roman"/>
+          <w:i/>
+          <w:sz w:val="24"/>
+        </w:rPr>
+      </w:pPr>
+      <w:r>
+        <w:rPr>
+          <w:rFonts w:ascii="Times New Roman" w:hAnsi="Times New Roman"/>
+          <w:i/>
+          <w:color w:val="FF0000"/>
+          <w:sz w:val="24"/>
+        </w:rPr>
+        <w:t>*****</w:t>
+      </w:r>
+    </w:p>
+    <w:p>
+      <w:pPr>
+        <w:spacing w:line="240" w:lineRule="auto"/>
+        <w:rPr>
+          <w:rFonts w:ascii="Times New Roman" w:hAnsi="Times New Roman"/>
+          <w:sz w:val="24"/>
+        </w:rPr>
+      </w:pPr>
+      <w:r>
+        <w:rPr>
+          <w:rFonts w:ascii="Times New Roman" w:hAnsi="Times New Roman"/>
+          <w:sz w:val="24"/>
+        </w:rPr>
+        <w:t xml:space="preserve">Стопи мої спрямуй за твоїм словом,* і ніяке беззаконня нехай не запанує наді мною. Визволь мене від людської обмови,* і я твої заповіді пильнуватиму. Світи своїм обличчям на слугу твого,* і навчи мене установ твоїх. </w:t>
+      </w:r>
+      <w:r>
+        <w:rPr>
+          <w:rFonts w:ascii="Times New Roman" w:hAnsi="Times New Roman"/>
+          <w:i/>
+          <w:color w:val="FF0000"/>
+          <w:sz w:val="24"/>
+        </w:rPr>
+        <w:t>(Пс. 118: 133-135)</w:t>
+      </w:r>
+    </w:p>
+    <w:p>
+      <w:pPr>
+        <w:spacing w:line="240" w:lineRule="auto"/>
+        <w:rPr>
+          <w:rFonts w:ascii="Times New Roman" w:hAnsi="Times New Roman"/>
+          <w:sz w:val="24"/>
+        </w:rPr>
+      </w:pPr>
+      <w:r>
+        <w:rPr>
+          <w:rFonts w:ascii="Times New Roman" w:hAnsi="Times New Roman"/>
+          <w:sz w:val="24"/>
+        </w:rPr>
+        <w:t xml:space="preserve">Нехай наповняться уста мої хвалою твоєю, Господи,* щоб оспівувати славу твою, увесь день – величність твою. </w:t>
+      </w:r>
+      <w:r>
+        <w:rPr>
+          <w:rFonts w:ascii="Times New Roman" w:hAnsi="Times New Roman"/>
+          <w:i/>
+          <w:color w:val="FF0000"/>
+          <w:sz w:val="24"/>
+        </w:rPr>
+        <w:t>(Пс. 70: 8)</w:t>
+      </w:r>
+    </w:p>
+    <w:p>
+      <w:pPr>
+        <w:spacing w:line="240" w:lineRule="auto"/>
+        <w:jc w:val="center"/>
+        <w:rPr>
+          <w:rFonts w:ascii="Times New Roman" w:hAnsi="Times New Roman"/>
+          <w:sz w:val="24"/>
+        </w:rPr>
+      </w:pPr>
+      <w:r>
+        <w:rPr>
+          <w:rFonts w:ascii="Times New Roman" w:hAnsi="Times New Roman"/>
+          <w:i/>
+          <w:color w:val="FF0000"/>
+          <w:sz w:val="24"/>
+        </w:rPr>
+        <w:t>*****</w:t>
+      </w:r>
+    </w:p>
+    <w:p>
+      <w:pPr>
+        <w:spacing w:line="240" w:lineRule="auto"/>
+        <w:rPr>
+          <w:rFonts w:ascii="Times New Roman" w:hAnsi="Times New Roman"/>
+          <w:sz w:val="24"/>
+        </w:rPr>
+      </w:pPr>
+      <w:r>
+        <w:rPr>
+          <w:rFonts w:ascii="Times New Roman" w:hAnsi="Times New Roman"/>
+          <w:sz w:val="24"/>
+        </w:rPr>
+        <w:t xml:space="preserve">Святий Боже, святий Кріпкий, святий Безсмертний, помилуй нас </w:t>
+      </w:r>
+      <w:r>
+        <w:rPr>
+          <w:rFonts w:ascii="Times New Roman" w:hAnsi="Times New Roman"/>
+          <w:i/>
+          <w:color w:val="FF0000"/>
+          <w:sz w:val="24"/>
+        </w:rPr>
+        <w:t>(3 р.)</w:t>
+      </w:r>
+      <w:r>
+        <w:rPr>
+          <w:rFonts w:ascii="Times New Roman" w:hAnsi="Times New Roman"/>
+          <w:sz w:val="24"/>
+        </w:rPr>
+        <w:t>.</w:t>
+      </w:r>
+    </w:p>
+    <w:p>
+      <w:pPr>
+        <w:spacing w:line="240" w:lineRule="auto"/>
+        <w:rPr>
+          <w:rFonts w:ascii="Times New Roman" w:hAnsi="Times New Roman"/>
+          <w:sz w:val="24"/>
+        </w:rPr>
+      </w:pPr>
+      <w:r>
+        <w:rPr>
+          <w:rFonts w:ascii="Times New Roman" w:hAnsi="Times New Roman"/>
+          <w:sz w:val="24"/>
+        </w:rPr>
+        <w:t>Слава Отцю, і Сину, і Святому Духові,* і нині і повсякчас, і на віки вічні. Амінь.</w:t>
+      </w:r>
+    </w:p>
+    <w:p>
+      <w:pPr>
+        <w:spacing w:line="240" w:lineRule="auto"/>
+        <w:rPr>
+          <w:rFonts w:ascii="Times New Roman" w:hAnsi="Times New Roman"/>
+          <w:sz w:val="24"/>
+        </w:rPr>
+      </w:pPr>
+      <w:r>
+        <w:rPr>
+          <w:rFonts w:ascii="Times New Roman" w:hAnsi="Times New Roman"/>
+          <w:sz w:val="24"/>
+        </w:rPr>
+        <w:t>Пресвята Тройце, помилуй нас;* Господи, очисти гріхи наші;* Владико, прости беззаконня наші;* Святий, завітай і зціли немочі наші імени твого ради.</w:t>
+      </w:r>
+    </w:p>
+    <w:p>
+      <w:pPr>
+        <w:spacing w:line="240" w:lineRule="auto"/>
+        <w:rPr>
+          <w:rFonts w:ascii="Times New Roman" w:hAnsi="Times New Roman"/>
+          <w:sz w:val="24"/>
+        </w:rPr>
+      </w:pPr>
+      <w:r>
+        <w:rPr>
+          <w:rFonts w:ascii="Times New Roman" w:hAnsi="Times New Roman"/>
+          <w:sz w:val="24"/>
+        </w:rPr>
+        <w:t xml:space="preserve">Господи, помилуй </w:t>
+      </w:r>
+      <w:r>
+        <w:rPr>
+          <w:rFonts w:ascii="Times New Roman" w:hAnsi="Times New Roman"/>
+          <w:i/>
+          <w:color w:val="FF0000"/>
+          <w:sz w:val="24"/>
+        </w:rPr>
+        <w:t>(3 р.)</w:t>
+      </w:r>
+      <w:r>
+        <w:rPr>
+          <w:rFonts w:ascii="Times New Roman" w:hAnsi="Times New Roman"/>
+          <w:sz w:val="24"/>
+        </w:rPr>
+        <w:t>.</w:t>
+      </w:r>
+    </w:p>
+    <w:p>
+      <w:pPr>
+        <w:spacing w:line="240" w:lineRule="auto"/>
+        <w:rPr>
+          <w:rFonts w:ascii="Times New Roman" w:hAnsi="Times New Roman"/>
+          <w:sz w:val="24"/>
+        </w:rPr>
+      </w:pPr>
+      <w:r>
+        <w:rPr>
+          <w:rFonts w:ascii="Times New Roman" w:hAnsi="Times New Roman"/>
+          <w:sz w:val="24"/>
+        </w:rPr>
+        <w:t>Слава Отцю, і Сину, і Святому Духові,* і нині і повсякчас, і на віки вічні. Амінь.</w:t>
+      </w:r>
+    </w:p>
+    <w:p>
+      <w:pPr>
+        <w:spacing w:line="240" w:lineRule="auto"/>
+        <w:rPr>
+          <w:rFonts w:ascii="Times New Roman" w:hAnsi="Times New Roman"/>
+          <w:sz w:val="24"/>
+        </w:rPr>
+      </w:pPr>
+      <w:r>
+        <w:rPr>
+          <w:rFonts w:ascii="Times New Roman" w:hAnsi="Times New Roman"/>
+          <w:sz w:val="24"/>
+        </w:rPr>
+        <w:t>Отче наш, що єси на небесах,* нехай святиться ім’я твоє,* нехай прийде царство твоє,* нехай буде воля твоя, як на небі, так і на землі.* Хліб наш насущний дай нам сьогодні,* і прости нам провини наші,* як і ми прощаємо винуватцям нашим,* і не введи нас у спокусу,* але визволи нас від лукавого.</w:t>
+      </w:r>
+    </w:p>
+    <w:p>
+      <w:pPr>
+        <w:spacing w:line="240" w:lineRule="auto"/>
+        <w:rPr>
+          <w:rFonts w:ascii="Times New Roman" w:hAnsi="Times New Roman"/>
+          <w:sz w:val="24"/>
+        </w:rPr>
+      </w:pPr>
+      <w:r>
+        <w:rPr>
+          <w:rFonts w:ascii="Times New Roman" w:hAnsi="Times New Roman"/>
+          <w:i/>
+          <w:color w:val="FF0000"/>
+          <w:sz w:val="24"/>
+        </w:rPr>
+        <w:t xml:space="preserve">Священик: </w:t>
+      </w:r>
+      <w:r>
+        <w:rPr>
+          <w:rFonts w:ascii="Times New Roman" w:hAnsi="Times New Roman"/>
+          <w:sz w:val="24"/>
+        </w:rPr>
+        <w:t>Бо твоє є царство, і сила, і слава, Отця, і Сина, і Святого Духа, нині і повсякчас, і на віки вічні.</w:t>
+      </w:r>
+    </w:p>
+    <w:p>
+      <w:pPr>
+        <w:spacing w:line="240" w:lineRule="auto"/>
+        <w:rPr>
+          <w:rFonts w:ascii="Times New Roman" w:hAnsi="Times New Roman"/>
+          <w:sz w:val="24"/>
+        </w:rPr>
+      </w:pPr>
+      <w:r>
+        <w:rPr>
+          <w:rFonts w:ascii="Times New Roman" w:hAnsi="Times New Roman"/>
+          <w:i/>
+          <w:color w:val="FF0000"/>
+          <w:sz w:val="24"/>
+        </w:rPr>
+        <w:t xml:space="preserve">Вірні: </w:t>
+      </w:r>
+      <w:r>
+        <w:rPr>
+          <w:rFonts w:ascii="Times New Roman" w:hAnsi="Times New Roman"/>
+          <w:sz w:val="24"/>
+        </w:rPr>
+        <w:t>Амінь.</w:t>
+      </w:r>
+    </w:p>
+    <w:p>
+      <w:r>
+        <w:rPr>
+          <w:rFonts w:ascii="Times New Roman" w:hAnsi="Times New Roman"/>
+          <w:i/>
+          <w:color w:val="FF4400"/>
+          <w:sz w:val="24"/>
+        </w:rPr>
+        <w:t>Кондак (г. 8):</w:t>
       </w:r>
       <w:r>
         <w:rPr>
@@ -1222,813 +1532,7 @@
           <w:color w:val="000000"/>
           <w:sz w:val="24"/>
         </w:rPr>
-        <w:t>запеча́таний</w:t>
-      </w:r>
-      <w:r>
-        <w:rPr>
-          <w:rFonts w:ascii="Times New Roman" w:hAnsi="Times New Roman"/>
-          <w:color w:val="000000"/>
-          <w:sz w:val="24"/>
-        </w:rPr>
-        <w:t xml:space="preserve"> був гріб,* як життя́ із </w:t>
-      </w:r>
-      <w:r>
-        <w:rPr>
-          <w:rFonts w:ascii="Times New Roman" w:hAnsi="Times New Roman"/>
-          <w:color w:val="000000"/>
-          <w:sz w:val="24"/>
-        </w:rPr>
-        <w:t>гро́бу</w:t>
-      </w:r>
-      <w:r>
-        <w:rPr>
-          <w:rFonts w:ascii="Times New Roman" w:hAnsi="Times New Roman"/>
-          <w:color w:val="000000"/>
-          <w:sz w:val="24"/>
-        </w:rPr>
-        <w:t xml:space="preserve"> </w:t>
-      </w:r>
-      <w:r>
-        <w:rPr>
-          <w:rFonts w:ascii="Times New Roman" w:hAnsi="Times New Roman"/>
-          <w:color w:val="000000"/>
-          <w:sz w:val="24"/>
-        </w:rPr>
-        <w:t>возсія́в</w:t>
-      </w:r>
-      <w:r>
-        <w:rPr>
-          <w:rFonts w:ascii="Times New Roman" w:hAnsi="Times New Roman"/>
-          <w:color w:val="000000"/>
-          <w:sz w:val="24"/>
-        </w:rPr>
-        <w:t xml:space="preserve"> Ти, </w:t>
-      </w:r>
-      <w:r>
-        <w:rPr>
-          <w:rFonts w:ascii="Times New Roman" w:hAnsi="Times New Roman"/>
-          <w:color w:val="000000"/>
-          <w:sz w:val="24"/>
-        </w:rPr>
-        <w:t>Хри́сте</w:t>
-      </w:r>
-      <w:r>
-        <w:rPr>
-          <w:rFonts w:ascii="Times New Roman" w:hAnsi="Times New Roman"/>
-          <w:color w:val="000000"/>
-          <w:sz w:val="24"/>
-        </w:rPr>
-        <w:t xml:space="preserve"> </w:t>
-      </w:r>
-      <w:r>
-        <w:rPr>
-          <w:rFonts w:ascii="Times New Roman" w:hAnsi="Times New Roman"/>
-          <w:color w:val="000000"/>
-          <w:sz w:val="24"/>
-        </w:rPr>
-        <w:t>Бо́же</w:t>
-      </w:r>
-      <w:r>
-        <w:rPr>
-          <w:rFonts w:ascii="Times New Roman" w:hAnsi="Times New Roman"/>
-          <w:color w:val="000000"/>
-          <w:sz w:val="24"/>
-        </w:rPr>
-        <w:t xml:space="preserve">,* і, хоч </w:t>
-      </w:r>
-      <w:r>
-        <w:rPr>
-          <w:rFonts w:ascii="Times New Roman" w:hAnsi="Times New Roman"/>
-          <w:color w:val="000000"/>
-          <w:sz w:val="24"/>
-        </w:rPr>
-        <w:t>за́мкнені</w:t>
-      </w:r>
-      <w:r>
-        <w:rPr>
-          <w:rFonts w:ascii="Times New Roman" w:hAnsi="Times New Roman"/>
-          <w:color w:val="000000"/>
-          <w:sz w:val="24"/>
-        </w:rPr>
-        <w:t xml:space="preserve"> були́ </w:t>
-      </w:r>
-      <w:r>
-        <w:rPr>
-          <w:rFonts w:ascii="Times New Roman" w:hAnsi="Times New Roman"/>
-          <w:color w:val="000000"/>
-          <w:sz w:val="24"/>
-        </w:rPr>
-        <w:t>две́рі</w:t>
-      </w:r>
-      <w:r>
-        <w:rPr>
-          <w:rFonts w:ascii="Times New Roman" w:hAnsi="Times New Roman"/>
-          <w:color w:val="000000"/>
-          <w:sz w:val="24"/>
-        </w:rPr>
-        <w:t xml:space="preserve">,* </w:t>
-      </w:r>
-      <w:r>
-        <w:rPr>
-          <w:rFonts w:ascii="Times New Roman" w:hAnsi="Times New Roman"/>
-          <w:color w:val="000000"/>
-          <w:sz w:val="24"/>
-        </w:rPr>
-        <w:t>ученика́м</w:t>
-      </w:r>
-      <w:r>
-        <w:rPr>
-          <w:rFonts w:ascii="Times New Roman" w:hAnsi="Times New Roman"/>
-          <w:color w:val="000000"/>
-          <w:sz w:val="24"/>
-        </w:rPr>
-        <w:t xml:space="preserve"> </w:t>
-      </w:r>
-      <w:r>
-        <w:rPr>
-          <w:rFonts w:ascii="Times New Roman" w:hAnsi="Times New Roman"/>
-          <w:color w:val="000000"/>
-          <w:sz w:val="24"/>
-        </w:rPr>
-        <w:t>предста́в</w:t>
-      </w:r>
-      <w:r>
-        <w:rPr>
-          <w:rFonts w:ascii="Times New Roman" w:hAnsi="Times New Roman"/>
-          <w:color w:val="000000"/>
-          <w:sz w:val="24"/>
-        </w:rPr>
-        <w:t xml:space="preserve"> єси́, як </w:t>
-      </w:r>
-      <w:r>
-        <w:rPr>
-          <w:rFonts w:ascii="Times New Roman" w:hAnsi="Times New Roman"/>
-          <w:color w:val="000000"/>
-          <w:sz w:val="24"/>
-        </w:rPr>
-        <w:t>воскресі́ння</w:t>
-      </w:r>
-      <w:r>
-        <w:rPr>
-          <w:rFonts w:ascii="Times New Roman" w:hAnsi="Times New Roman"/>
-          <w:color w:val="000000"/>
-          <w:sz w:val="24"/>
-        </w:rPr>
-        <w:t xml:space="preserve"> всіх,* дух </w:t>
-      </w:r>
-      <w:r>
-        <w:rPr>
-          <w:rFonts w:ascii="Times New Roman" w:hAnsi="Times New Roman"/>
-          <w:color w:val="000000"/>
-          <w:sz w:val="24"/>
-        </w:rPr>
-        <w:t>пра́вий</w:t>
-      </w:r>
-      <w:r>
-        <w:rPr>
-          <w:rFonts w:ascii="Times New Roman" w:hAnsi="Times New Roman"/>
-          <w:color w:val="000000"/>
-          <w:sz w:val="24"/>
-        </w:rPr>
-        <w:t xml:space="preserve"> </w:t>
-      </w:r>
-      <w:r>
-        <w:rPr>
-          <w:rFonts w:ascii="Times New Roman" w:hAnsi="Times New Roman"/>
-          <w:color w:val="000000"/>
-          <w:sz w:val="24"/>
-        </w:rPr>
-        <w:t>че́рез</w:t>
-      </w:r>
-      <w:r>
-        <w:rPr>
-          <w:rFonts w:ascii="Times New Roman" w:hAnsi="Times New Roman"/>
-          <w:color w:val="000000"/>
-          <w:sz w:val="24"/>
-        </w:rPr>
-        <w:t xml:space="preserve"> них </w:t>
-      </w:r>
-      <w:r>
-        <w:rPr>
-          <w:rFonts w:ascii="Times New Roman" w:hAnsi="Times New Roman"/>
-          <w:color w:val="000000"/>
-          <w:sz w:val="24"/>
-        </w:rPr>
-        <w:t>обно́влюючи</w:t>
-      </w:r>
-      <w:r>
-        <w:rPr>
-          <w:rFonts w:ascii="Times New Roman" w:hAnsi="Times New Roman"/>
-          <w:color w:val="000000"/>
-          <w:sz w:val="24"/>
-        </w:rPr>
-        <w:t xml:space="preserve"> нам,* по </w:t>
-      </w:r>
-      <w:r>
-        <w:rPr>
-          <w:rFonts w:ascii="Times New Roman" w:hAnsi="Times New Roman"/>
-          <w:color w:val="000000"/>
-          <w:sz w:val="24"/>
-        </w:rPr>
-        <w:t>вели́кій</w:t>
-      </w:r>
-      <w:r>
-        <w:rPr>
-          <w:rFonts w:ascii="Times New Roman" w:hAnsi="Times New Roman"/>
-          <w:color w:val="000000"/>
-          <w:sz w:val="24"/>
-        </w:rPr>
-        <w:t xml:space="preserve"> </w:t>
-      </w:r>
-      <w:r>
-        <w:rPr>
-          <w:rFonts w:ascii="Times New Roman" w:hAnsi="Times New Roman"/>
-          <w:color w:val="000000"/>
-          <w:sz w:val="24"/>
-        </w:rPr>
-        <w:t>Твої́й</w:t>
-      </w:r>
-      <w:r>
-        <w:rPr>
-          <w:rFonts w:ascii="Times New Roman" w:hAnsi="Times New Roman"/>
-          <w:color w:val="000000"/>
-          <w:sz w:val="24"/>
-        </w:rPr>
-        <w:t xml:space="preserve"> </w:t>
-      </w:r>
-      <w:r>
-        <w:rPr>
-          <w:rFonts w:ascii="Times New Roman" w:hAnsi="Times New Roman"/>
-          <w:color w:val="000000"/>
-          <w:sz w:val="24"/>
-        </w:rPr>
-        <w:t>ми́лості</w:t>
-      </w:r>
-      <w:r>
-        <w:rPr>
-          <w:rFonts w:ascii="Times New Roman" w:hAnsi="Times New Roman"/>
-          <w:color w:val="000000"/>
-          <w:sz w:val="24"/>
-        </w:rPr>
-        <w:t>.</w:t>
-      </w:r>
-    </w:p>
-    <w:p>
-      <w:pPr>
-        <w:spacing w:line="240" w:lineRule="auto"/>
-        <w:rPr>
-          <w:rFonts w:ascii="Times New Roman" w:hAnsi="Times New Roman"/>
-          <w:sz w:val="24"/>
-        </w:rPr>
-      </w:pPr>
-      <w:r>
-        <w:rPr>
-          <w:rFonts w:ascii="Times New Roman" w:hAnsi="Times New Roman"/>
-          <w:sz w:val="24"/>
-        </w:rPr>
-        <w:t>І нині, і повсякчас, і на віки вічні. Амінь.</w:t>
-      </w:r>
-    </w:p>
-    <w:p>
-      <w:pPr>
-        <w:spacing w:line="240" w:lineRule="auto"/>
-        <w:rPr>
-          <w:rFonts w:ascii="Times New Roman" w:hAnsi="Times New Roman"/>
-          <w:sz w:val="24"/>
-        </w:rPr>
-      </w:pPr>
-      <w:r>
-        <w:rPr>
-          <w:rFonts w:ascii="Times New Roman" w:hAnsi="Times New Roman"/>
-          <w:sz w:val="24"/>
-        </w:rPr>
-        <w:t>Як нам називати тебе, Благодатна?* Небом? – Ти бо випромінила Сонце Правди.* Раєм? Ти бо виростила нам Квіт нетління.* Дівою – Ти бо зосталася нетлінна.* Чистою Матір'ю? – Ти бо носила у святих обіймах твоїх Сина, всіх Бога.* Його ж моли, щоб спас душі наші.</w:t>
-      </w:r>
-    </w:p>
-    <w:p>
-      <w:pPr>
-        <w:spacing w:line="240" w:lineRule="auto"/>
-        <w:jc w:val="center"/>
-        <w:rPr>
-          <w:rFonts w:ascii="Times New Roman" w:hAnsi="Times New Roman"/>
-          <w:i/>
-          <w:sz w:val="24"/>
-        </w:rPr>
-      </w:pPr>
-      <w:r>
-        <w:rPr>
-          <w:rFonts w:ascii="Times New Roman" w:hAnsi="Times New Roman"/>
-          <w:i/>
-          <w:color w:val="FF0000"/>
-          <w:sz w:val="24"/>
-        </w:rPr>
-        <w:t>*****</w:t>
-      </w:r>
-    </w:p>
-    <w:p>
-      <w:pPr>
-        <w:spacing w:line="240" w:lineRule="auto"/>
-        <w:rPr>
-          <w:rFonts w:ascii="Times New Roman" w:hAnsi="Times New Roman"/>
-          <w:sz w:val="24"/>
-        </w:rPr>
-      </w:pPr>
-      <w:r>
-        <w:rPr>
-          <w:rFonts w:ascii="Times New Roman" w:hAnsi="Times New Roman"/>
-          <w:sz w:val="24"/>
-        </w:rPr>
-        <w:t xml:space="preserve">Стопи мої спрямуй за твоїм словом,* і ніяке беззаконня нехай не запанує наді мною. Визволь мене від людської обмови,* і я твої заповіді пильнуватиму. Світи своїм обличчям на слугу твого,* і навчи мене установ твоїх. </w:t>
-      </w:r>
-      <w:r>
-        <w:rPr>
-          <w:rFonts w:ascii="Times New Roman" w:hAnsi="Times New Roman"/>
-          <w:i/>
-          <w:color w:val="FF0000"/>
-          <w:sz w:val="24"/>
-        </w:rPr>
-        <w:t>(Пс. 118: 133-135)</w:t>
-      </w:r>
-    </w:p>
-    <w:p>
-      <w:pPr>
-        <w:spacing w:line="240" w:lineRule="auto"/>
-        <w:rPr>
-          <w:rFonts w:ascii="Times New Roman" w:hAnsi="Times New Roman"/>
-          <w:sz w:val="24"/>
-        </w:rPr>
-      </w:pPr>
-      <w:r>
-        <w:rPr>
-          <w:rFonts w:ascii="Times New Roman" w:hAnsi="Times New Roman"/>
-          <w:sz w:val="24"/>
-        </w:rPr>
-        <w:t xml:space="preserve">Нехай наповняться уста мої хвалою твоєю, Господи,* щоб оспівувати славу твою, увесь день – величність твою. </w:t>
-      </w:r>
-      <w:r>
-        <w:rPr>
-          <w:rFonts w:ascii="Times New Roman" w:hAnsi="Times New Roman"/>
-          <w:i/>
-          <w:color w:val="FF0000"/>
-          <w:sz w:val="24"/>
-        </w:rPr>
-        <w:t>(Пс. 70: 8)</w:t>
-      </w:r>
-    </w:p>
-    <w:p>
-      <w:pPr>
-        <w:spacing w:line="240" w:lineRule="auto"/>
-        <w:jc w:val="center"/>
-        <w:rPr>
-          <w:rFonts w:ascii="Times New Roman" w:hAnsi="Times New Roman"/>
-          <w:sz w:val="24"/>
-        </w:rPr>
-      </w:pPr>
-      <w:r>
-        <w:rPr>
-          <w:rFonts w:ascii="Times New Roman" w:hAnsi="Times New Roman"/>
-          <w:i/>
-          <w:color w:val="FF0000"/>
-          <w:sz w:val="24"/>
-        </w:rPr>
-        <w:t>*****</w:t>
-      </w:r>
-    </w:p>
-    <w:p>
-      <w:pPr>
-        <w:spacing w:line="240" w:lineRule="auto"/>
-        <w:rPr>
-          <w:rFonts w:ascii="Times New Roman" w:hAnsi="Times New Roman"/>
-          <w:sz w:val="24"/>
-        </w:rPr>
-      </w:pPr>
-      <w:r>
-        <w:rPr>
-          <w:rFonts w:ascii="Times New Roman" w:hAnsi="Times New Roman"/>
-          <w:sz w:val="24"/>
-        </w:rPr>
-        <w:t xml:space="preserve">Святий Боже, святий Кріпкий, святий Безсмертний, помилуй нас </w:t>
-      </w:r>
-      <w:r>
-        <w:rPr>
-          <w:rFonts w:ascii="Times New Roman" w:hAnsi="Times New Roman"/>
-          <w:i/>
-          <w:color w:val="FF0000"/>
-          <w:sz w:val="24"/>
-        </w:rPr>
-        <w:t>(3 р.)</w:t>
-      </w:r>
-      <w:r>
-        <w:rPr>
-          <w:rFonts w:ascii="Times New Roman" w:hAnsi="Times New Roman"/>
-          <w:sz w:val="24"/>
-        </w:rPr>
-        <w:t>.</w:t>
-      </w:r>
-    </w:p>
-    <w:p>
-      <w:pPr>
-        <w:spacing w:line="240" w:lineRule="auto"/>
-        <w:rPr>
-          <w:rFonts w:ascii="Times New Roman" w:hAnsi="Times New Roman"/>
-          <w:sz w:val="24"/>
-        </w:rPr>
-      </w:pPr>
-      <w:r>
-        <w:rPr>
-          <w:rFonts w:ascii="Times New Roman" w:hAnsi="Times New Roman"/>
-          <w:sz w:val="24"/>
-        </w:rPr>
-        <w:t>Слава Отцю, і Сину, і Святому Духові,* і нині і повсякчас, і на віки вічні. Амінь.</w:t>
-      </w:r>
-    </w:p>
-    <w:p>
-      <w:pPr>
-        <w:spacing w:line="240" w:lineRule="auto"/>
-        <w:rPr>
-          <w:rFonts w:ascii="Times New Roman" w:hAnsi="Times New Roman"/>
-          <w:sz w:val="24"/>
-        </w:rPr>
-      </w:pPr>
-      <w:r>
-        <w:rPr>
-          <w:rFonts w:ascii="Times New Roman" w:hAnsi="Times New Roman"/>
-          <w:sz w:val="24"/>
-        </w:rPr>
-        <w:t>Пресвята Тройце, помилуй нас;* Господи, очисти гріхи наші;* Владико, прости беззаконня наші;* Святий, завітай і зціли немочі наші імени твого ради.</w:t>
-      </w:r>
-    </w:p>
-    <w:p>
-      <w:pPr>
-        <w:spacing w:line="240" w:lineRule="auto"/>
-        <w:rPr>
-          <w:rFonts w:ascii="Times New Roman" w:hAnsi="Times New Roman"/>
-          <w:sz w:val="24"/>
-        </w:rPr>
-      </w:pPr>
-      <w:r>
-        <w:rPr>
-          <w:rFonts w:ascii="Times New Roman" w:hAnsi="Times New Roman"/>
-          <w:sz w:val="24"/>
-        </w:rPr>
-        <w:t xml:space="preserve">Господи, помилуй </w:t>
-      </w:r>
-      <w:r>
-        <w:rPr>
-          <w:rFonts w:ascii="Times New Roman" w:hAnsi="Times New Roman"/>
-          <w:i/>
-          <w:color w:val="FF0000"/>
-          <w:sz w:val="24"/>
-        </w:rPr>
-        <w:t>(3 р.)</w:t>
-      </w:r>
-      <w:r>
-        <w:rPr>
-          <w:rFonts w:ascii="Times New Roman" w:hAnsi="Times New Roman"/>
-          <w:sz w:val="24"/>
-        </w:rPr>
-        <w:t>.</w:t>
-      </w:r>
-    </w:p>
-    <w:p>
-      <w:pPr>
-        <w:spacing w:line="240" w:lineRule="auto"/>
-        <w:rPr>
-          <w:rFonts w:ascii="Times New Roman" w:hAnsi="Times New Roman"/>
-          <w:sz w:val="24"/>
-        </w:rPr>
-      </w:pPr>
-      <w:r>
-        <w:rPr>
-          <w:rFonts w:ascii="Times New Roman" w:hAnsi="Times New Roman"/>
-          <w:sz w:val="24"/>
-        </w:rPr>
-        <w:t>Слава Отцю, і Сину, і Святому Духові,* і нині і повсякчас, і на віки вічні. Амінь.</w:t>
-      </w:r>
-    </w:p>
-    <w:p>
-      <w:pPr>
-        <w:spacing w:line="240" w:lineRule="auto"/>
-        <w:rPr>
-          <w:rFonts w:ascii="Times New Roman" w:hAnsi="Times New Roman"/>
-          <w:sz w:val="24"/>
-        </w:rPr>
-      </w:pPr>
-      <w:r>
-        <w:rPr>
-          <w:rFonts w:ascii="Times New Roman" w:hAnsi="Times New Roman"/>
-          <w:sz w:val="24"/>
-        </w:rPr>
-        <w:t>Отче наш, що єси на небесах,* нехай святиться ім’я твоє,* нехай прийде царство твоє,* нехай буде воля твоя, як на небі, так і на землі.* Хліб наш насущний дай нам сьогодні,* і прости нам провини наші,* як і ми прощаємо винуватцям нашим,* і не введи нас у спокусу,* але визволи нас від лукавого.</w:t>
-      </w:r>
-    </w:p>
-    <w:p>
-      <w:pPr>
-        <w:spacing w:line="240" w:lineRule="auto"/>
-        <w:rPr>
-          <w:rFonts w:ascii="Times New Roman" w:hAnsi="Times New Roman"/>
-          <w:sz w:val="24"/>
-        </w:rPr>
-      </w:pPr>
-      <w:r>
-        <w:rPr>
-          <w:rFonts w:ascii="Times New Roman" w:hAnsi="Times New Roman"/>
-          <w:i/>
-          <w:color w:val="FF0000"/>
-          <w:sz w:val="24"/>
-        </w:rPr>
-        <w:t xml:space="preserve">Священик: </w:t>
-      </w:r>
-      <w:r>
-        <w:rPr>
-          <w:rFonts w:ascii="Times New Roman" w:hAnsi="Times New Roman"/>
-          <w:sz w:val="24"/>
-        </w:rPr>
-        <w:t>Бо твоє є царство, і сила, і слава, Отця, і Сина, і Святого Духа, нині і повсякчас, і на віки вічні.</w:t>
-      </w:r>
-    </w:p>
-    <w:p>
-      <w:pPr>
-        <w:spacing w:line="240" w:lineRule="auto"/>
-        <w:rPr>
-          <w:rFonts w:ascii="Times New Roman" w:hAnsi="Times New Roman"/>
-          <w:sz w:val="24"/>
-        </w:rPr>
-      </w:pPr>
-      <w:r>
-        <w:rPr>
-          <w:rFonts w:ascii="Times New Roman" w:hAnsi="Times New Roman"/>
-          <w:i/>
-          <w:color w:val="FF0000"/>
-          <w:sz w:val="24"/>
-        </w:rPr>
-        <w:t xml:space="preserve">Вірні: </w:t>
-      </w:r>
-      <w:r>
-        <w:rPr>
-          <w:rFonts w:ascii="Times New Roman" w:hAnsi="Times New Roman"/>
-          <w:sz w:val="24"/>
-        </w:rPr>
-        <w:t>Амінь.</w:t>
-      </w:r>
-    </w:p>
-    <w:p>
-      <w:r>
-        <w:rPr>
-          <w:rFonts w:ascii="Times New Roman" w:hAnsi="Times New Roman"/>
-          <w:i/>
-          <w:color w:val="FF4400"/>
-          <w:sz w:val="24"/>
-        </w:rPr>
-        <w:t>Кондак (г. 8):</w:t>
-      </w:r>
-      <w:r>
-        <w:rPr>
-          <w:rFonts w:ascii="Times New Roman" w:hAnsi="Times New Roman"/>
-          <w:color w:val="000000"/>
-          <w:sz w:val="24"/>
-        </w:rPr>
-        <w:t xml:space="preserve"> </w:t>
-      </w:r>
-      <w:r>
-        <w:rPr>
-          <w:rFonts w:ascii="Times New Roman" w:hAnsi="Times New Roman"/>
-          <w:color w:val="000000"/>
-          <w:sz w:val="24"/>
-        </w:rPr>
-        <w:t>Допитли́вою</w:t>
-      </w:r>
-      <w:r>
-        <w:rPr>
-          <w:rFonts w:ascii="Times New Roman" w:hAnsi="Times New Roman"/>
-          <w:color w:val="000000"/>
-          <w:sz w:val="24"/>
-        </w:rPr>
-        <w:t xml:space="preserve"> </w:t>
-      </w:r>
-      <w:r>
-        <w:rPr>
-          <w:rFonts w:ascii="Times New Roman" w:hAnsi="Times New Roman"/>
-          <w:color w:val="000000"/>
-          <w:sz w:val="24"/>
-        </w:rPr>
-        <w:t>десни́цею</w:t>
-      </w:r>
-      <w:r>
-        <w:rPr>
-          <w:rFonts w:ascii="Times New Roman" w:hAnsi="Times New Roman"/>
-          <w:color w:val="000000"/>
-          <w:sz w:val="24"/>
-        </w:rPr>
-        <w:t xml:space="preserve">* </w:t>
-      </w:r>
-      <w:r>
-        <w:rPr>
-          <w:rFonts w:ascii="Times New Roman" w:hAnsi="Times New Roman"/>
-          <w:color w:val="000000"/>
-          <w:sz w:val="24"/>
-        </w:rPr>
-        <w:t>життєда́йні</w:t>
-      </w:r>
-      <w:r>
-        <w:rPr>
-          <w:rFonts w:ascii="Times New Roman" w:hAnsi="Times New Roman"/>
-          <w:color w:val="000000"/>
-          <w:sz w:val="24"/>
-        </w:rPr>
-        <w:t xml:space="preserve"> Твої́ </w:t>
-      </w:r>
-      <w:r>
-        <w:rPr>
-          <w:rFonts w:ascii="Times New Roman" w:hAnsi="Times New Roman"/>
-          <w:color w:val="000000"/>
-          <w:sz w:val="24"/>
-        </w:rPr>
-        <w:t>ре́бра</w:t>
-      </w:r>
-      <w:r>
-        <w:rPr>
-          <w:rFonts w:ascii="Times New Roman" w:hAnsi="Times New Roman"/>
-          <w:color w:val="000000"/>
-          <w:sz w:val="24"/>
-        </w:rPr>
-        <w:t xml:space="preserve"> Тома́ </w:t>
-      </w:r>
-      <w:r>
-        <w:rPr>
-          <w:rFonts w:ascii="Times New Roman" w:hAnsi="Times New Roman"/>
-          <w:color w:val="000000"/>
-          <w:sz w:val="24"/>
-        </w:rPr>
-        <w:t>прові́рив</w:t>
-      </w:r>
-      <w:r>
-        <w:rPr>
-          <w:rFonts w:ascii="Times New Roman" w:hAnsi="Times New Roman"/>
-          <w:color w:val="000000"/>
-          <w:sz w:val="24"/>
-        </w:rPr>
-        <w:t xml:space="preserve">, </w:t>
-      </w:r>
-      <w:r>
-        <w:rPr>
-          <w:rFonts w:ascii="Times New Roman" w:hAnsi="Times New Roman"/>
-          <w:color w:val="000000"/>
-          <w:sz w:val="24"/>
-        </w:rPr>
-        <w:t>Хри́сте</w:t>
-      </w:r>
-      <w:r>
-        <w:rPr>
-          <w:rFonts w:ascii="Times New Roman" w:hAnsi="Times New Roman"/>
-          <w:color w:val="000000"/>
-          <w:sz w:val="24"/>
-        </w:rPr>
-        <w:t xml:space="preserve"> </w:t>
-      </w:r>
-      <w:r>
-        <w:rPr>
-          <w:rFonts w:ascii="Times New Roman" w:hAnsi="Times New Roman"/>
-          <w:color w:val="000000"/>
-          <w:sz w:val="24"/>
-        </w:rPr>
-        <w:t>Бо́же</w:t>
-      </w:r>
-      <w:r>
-        <w:rPr>
-          <w:rFonts w:ascii="Times New Roman" w:hAnsi="Times New Roman"/>
-          <w:color w:val="000000"/>
-          <w:sz w:val="24"/>
-        </w:rPr>
-        <w:t xml:space="preserve">,* бо, хоч </w:t>
-      </w:r>
-      <w:r>
-        <w:rPr>
-          <w:rFonts w:ascii="Times New Roman" w:hAnsi="Times New Roman"/>
-          <w:color w:val="000000"/>
-          <w:sz w:val="24"/>
-        </w:rPr>
-        <w:t>за́мкнені</w:t>
-      </w:r>
-      <w:r>
-        <w:rPr>
-          <w:rFonts w:ascii="Times New Roman" w:hAnsi="Times New Roman"/>
-          <w:color w:val="000000"/>
-          <w:sz w:val="24"/>
-        </w:rPr>
-        <w:t xml:space="preserve"> були́ </w:t>
-      </w:r>
-      <w:r>
-        <w:rPr>
-          <w:rFonts w:ascii="Times New Roman" w:hAnsi="Times New Roman"/>
-          <w:color w:val="000000"/>
-          <w:sz w:val="24"/>
-        </w:rPr>
-        <w:t>две́рі</w:t>
-      </w:r>
-      <w:r>
-        <w:rPr>
-          <w:rFonts w:ascii="Times New Roman" w:hAnsi="Times New Roman"/>
-          <w:color w:val="000000"/>
-          <w:sz w:val="24"/>
-        </w:rPr>
-        <w:t xml:space="preserve">, як Ти </w:t>
-      </w:r>
-      <w:r>
-        <w:rPr>
-          <w:rFonts w:ascii="Times New Roman" w:hAnsi="Times New Roman"/>
-          <w:color w:val="000000"/>
-          <w:sz w:val="24"/>
-        </w:rPr>
-        <w:t>увійшо́в</w:t>
-      </w:r>
-      <w:r>
-        <w:rPr>
-          <w:rFonts w:ascii="Times New Roman" w:hAnsi="Times New Roman"/>
-          <w:color w:val="000000"/>
-          <w:sz w:val="24"/>
-        </w:rPr>
-        <w:t xml:space="preserve">,* він із </w:t>
-      </w:r>
-      <w:r>
-        <w:rPr>
-          <w:rFonts w:ascii="Times New Roman" w:hAnsi="Times New Roman"/>
-          <w:color w:val="000000"/>
-          <w:sz w:val="24"/>
-        </w:rPr>
-        <w:t>і́ншими</w:t>
-      </w:r>
-      <w:r>
-        <w:rPr>
-          <w:rFonts w:ascii="Times New Roman" w:hAnsi="Times New Roman"/>
-          <w:color w:val="000000"/>
-          <w:sz w:val="24"/>
-        </w:rPr>
-        <w:t xml:space="preserve"> </w:t>
-      </w:r>
-      <w:r>
-        <w:rPr>
-          <w:rFonts w:ascii="Times New Roman" w:hAnsi="Times New Roman"/>
-          <w:color w:val="000000"/>
-          <w:sz w:val="24"/>
-        </w:rPr>
-        <w:t>Апо́столами</w:t>
-      </w:r>
-      <w:r>
-        <w:rPr>
-          <w:rFonts w:ascii="Times New Roman" w:hAnsi="Times New Roman"/>
-          <w:color w:val="000000"/>
-          <w:sz w:val="24"/>
-        </w:rPr>
-        <w:t xml:space="preserve"> </w:t>
-      </w:r>
-      <w:r>
-        <w:rPr>
-          <w:rFonts w:ascii="Times New Roman" w:hAnsi="Times New Roman"/>
-          <w:color w:val="000000"/>
-          <w:sz w:val="24"/>
-        </w:rPr>
-        <w:t>кли́кав</w:t>
-      </w:r>
-      <w:r>
-        <w:rPr>
-          <w:rFonts w:ascii="Times New Roman" w:hAnsi="Times New Roman"/>
-          <w:color w:val="000000"/>
-          <w:sz w:val="24"/>
-        </w:rPr>
-        <w:t xml:space="preserve"> до </w:t>
-      </w:r>
-      <w:r>
-        <w:rPr>
-          <w:rFonts w:ascii="Times New Roman" w:hAnsi="Times New Roman"/>
-          <w:color w:val="000000"/>
-          <w:sz w:val="24"/>
-        </w:rPr>
-        <w:t>Те́бе</w:t>
-      </w:r>
-      <w:r>
-        <w:rPr>
-          <w:rFonts w:ascii="Times New Roman" w:hAnsi="Times New Roman"/>
-          <w:color w:val="000000"/>
-          <w:sz w:val="24"/>
-        </w:rPr>
-        <w:t xml:space="preserve">:* </w:t>
-      </w:r>
-      <w:r>
-        <w:rPr>
-          <w:rFonts w:ascii="Times New Roman" w:hAnsi="Times New Roman"/>
-          <w:color w:val="000000"/>
-          <w:sz w:val="24"/>
-        </w:rPr>
-        <w:t>Госпо́дь</w:t>
-      </w:r>
-      <w:r>
-        <w:rPr>
-          <w:rFonts w:ascii="Times New Roman" w:hAnsi="Times New Roman"/>
-          <w:color w:val="000000"/>
-          <w:sz w:val="24"/>
-        </w:rPr>
-        <w:t xml:space="preserve"> єси́ і Бог мій.</w:t>
+        <w:t xml:space="preserve"> Допитли́вою десни́цею* життєда́йні Твої́ ре́бра Тома́ прові́рив, Хри́сте Бо́же,* бо, хоч за́мкнені були́ две́рі, як Ти увійшо́в,* він із і́ншими Апо́столами кли́кав до Те́бе:* Госпо́дь єси́ і Бог мій.</w:t>
       </w:r>
     </w:p>
     <w:p>
@@ -4063,263 +3567,7 @@
           <w:color w:val="000000"/>
           <w:sz w:val="24"/>
         </w:rPr>
-        <w:t xml:space="preserve">Хоч </w:t>
-      </w:r>
-      <w:r>
-        <w:rPr>
-          <w:rFonts w:ascii="Times New Roman" w:hAnsi="Times New Roman"/>
-          <w:color w:val="000000"/>
-          <w:sz w:val="24"/>
-        </w:rPr>
-        <w:t>запеча́таний</w:t>
-      </w:r>
-      <w:r>
-        <w:rPr>
-          <w:rFonts w:ascii="Times New Roman" w:hAnsi="Times New Roman"/>
-          <w:color w:val="000000"/>
-          <w:sz w:val="24"/>
-        </w:rPr>
-        <w:t xml:space="preserve"> був гріб,* як життя́ із </w:t>
-      </w:r>
-      <w:r>
-        <w:rPr>
-          <w:rFonts w:ascii="Times New Roman" w:hAnsi="Times New Roman"/>
-          <w:color w:val="000000"/>
-          <w:sz w:val="24"/>
-        </w:rPr>
-        <w:t>гро́бу</w:t>
-      </w:r>
-      <w:r>
-        <w:rPr>
-          <w:rFonts w:ascii="Times New Roman" w:hAnsi="Times New Roman"/>
-          <w:color w:val="000000"/>
-          <w:sz w:val="24"/>
-        </w:rPr>
-        <w:t xml:space="preserve"> </w:t>
-      </w:r>
-      <w:r>
-        <w:rPr>
-          <w:rFonts w:ascii="Times New Roman" w:hAnsi="Times New Roman"/>
-          <w:color w:val="000000"/>
-          <w:sz w:val="24"/>
-        </w:rPr>
-        <w:t>возсія́в</w:t>
-      </w:r>
-      <w:r>
-        <w:rPr>
-          <w:rFonts w:ascii="Times New Roman" w:hAnsi="Times New Roman"/>
-          <w:color w:val="000000"/>
-          <w:sz w:val="24"/>
-        </w:rPr>
-        <w:t xml:space="preserve"> Ти, </w:t>
-      </w:r>
-      <w:r>
-        <w:rPr>
-          <w:rFonts w:ascii="Times New Roman" w:hAnsi="Times New Roman"/>
-          <w:color w:val="000000"/>
-          <w:sz w:val="24"/>
-        </w:rPr>
-        <w:t>Хри́сте</w:t>
-      </w:r>
-      <w:r>
-        <w:rPr>
-          <w:rFonts w:ascii="Times New Roman" w:hAnsi="Times New Roman"/>
-          <w:color w:val="000000"/>
-          <w:sz w:val="24"/>
-        </w:rPr>
-        <w:t xml:space="preserve"> </w:t>
-      </w:r>
-      <w:r>
-        <w:rPr>
-          <w:rFonts w:ascii="Times New Roman" w:hAnsi="Times New Roman"/>
-          <w:color w:val="000000"/>
-          <w:sz w:val="24"/>
-        </w:rPr>
-        <w:t>Бо́же</w:t>
-      </w:r>
-      <w:r>
-        <w:rPr>
-          <w:rFonts w:ascii="Times New Roman" w:hAnsi="Times New Roman"/>
-          <w:color w:val="000000"/>
-          <w:sz w:val="24"/>
-        </w:rPr>
-        <w:t xml:space="preserve">,* і, хоч </w:t>
-      </w:r>
-      <w:r>
-        <w:rPr>
-          <w:rFonts w:ascii="Times New Roman" w:hAnsi="Times New Roman"/>
-          <w:color w:val="000000"/>
-          <w:sz w:val="24"/>
-        </w:rPr>
-        <w:t>за́мкнені</w:t>
-      </w:r>
-      <w:r>
-        <w:rPr>
-          <w:rFonts w:ascii="Times New Roman" w:hAnsi="Times New Roman"/>
-          <w:color w:val="000000"/>
-          <w:sz w:val="24"/>
-        </w:rPr>
-        <w:t xml:space="preserve"> були́ </w:t>
-      </w:r>
-      <w:r>
-        <w:rPr>
-          <w:rFonts w:ascii="Times New Roman" w:hAnsi="Times New Roman"/>
-          <w:color w:val="000000"/>
-          <w:sz w:val="24"/>
-        </w:rPr>
-        <w:t>две́рі</w:t>
-      </w:r>
-      <w:r>
-        <w:rPr>
-          <w:rFonts w:ascii="Times New Roman" w:hAnsi="Times New Roman"/>
-          <w:color w:val="000000"/>
-          <w:sz w:val="24"/>
-        </w:rPr>
-        <w:t xml:space="preserve">,* </w:t>
-      </w:r>
-      <w:r>
-        <w:rPr>
-          <w:rFonts w:ascii="Times New Roman" w:hAnsi="Times New Roman"/>
-          <w:color w:val="000000"/>
-          <w:sz w:val="24"/>
-        </w:rPr>
-        <w:t>ученика́м</w:t>
-      </w:r>
-      <w:r>
-        <w:rPr>
-          <w:rFonts w:ascii="Times New Roman" w:hAnsi="Times New Roman"/>
-          <w:color w:val="000000"/>
-          <w:sz w:val="24"/>
-        </w:rPr>
-        <w:t xml:space="preserve"> </w:t>
-      </w:r>
-      <w:r>
-        <w:rPr>
-          <w:rFonts w:ascii="Times New Roman" w:hAnsi="Times New Roman"/>
-          <w:color w:val="000000"/>
-          <w:sz w:val="24"/>
-        </w:rPr>
-        <w:t>предста́в</w:t>
-      </w:r>
-      <w:r>
-        <w:rPr>
-          <w:rFonts w:ascii="Times New Roman" w:hAnsi="Times New Roman"/>
-          <w:color w:val="000000"/>
-          <w:sz w:val="24"/>
-        </w:rPr>
-        <w:t xml:space="preserve"> єси́, як </w:t>
-      </w:r>
-      <w:r>
-        <w:rPr>
-          <w:rFonts w:ascii="Times New Roman" w:hAnsi="Times New Roman"/>
-          <w:color w:val="000000"/>
-          <w:sz w:val="24"/>
-        </w:rPr>
-        <w:t>воскресі́ння</w:t>
-      </w:r>
-      <w:r>
-        <w:rPr>
-          <w:rFonts w:ascii="Times New Roman" w:hAnsi="Times New Roman"/>
-          <w:color w:val="000000"/>
-          <w:sz w:val="24"/>
-        </w:rPr>
-        <w:t xml:space="preserve"> всіх,* дух </w:t>
-      </w:r>
-      <w:r>
-        <w:rPr>
-          <w:rFonts w:ascii="Times New Roman" w:hAnsi="Times New Roman"/>
-          <w:color w:val="000000"/>
-          <w:sz w:val="24"/>
-        </w:rPr>
-        <w:t>пра́вий</w:t>
-      </w:r>
-      <w:r>
-        <w:rPr>
-          <w:rFonts w:ascii="Times New Roman" w:hAnsi="Times New Roman"/>
-          <w:color w:val="000000"/>
-          <w:sz w:val="24"/>
-        </w:rPr>
-        <w:t xml:space="preserve"> </w:t>
-      </w:r>
-      <w:r>
-        <w:rPr>
-          <w:rFonts w:ascii="Times New Roman" w:hAnsi="Times New Roman"/>
-          <w:color w:val="000000"/>
-          <w:sz w:val="24"/>
-        </w:rPr>
-        <w:t>че́рез</w:t>
-      </w:r>
-      <w:r>
-        <w:rPr>
-          <w:rFonts w:ascii="Times New Roman" w:hAnsi="Times New Roman"/>
-          <w:color w:val="000000"/>
-          <w:sz w:val="24"/>
-        </w:rPr>
-        <w:t xml:space="preserve"> них </w:t>
-      </w:r>
-      <w:r>
-        <w:rPr>
-          <w:rFonts w:ascii="Times New Roman" w:hAnsi="Times New Roman"/>
-          <w:color w:val="000000"/>
-          <w:sz w:val="24"/>
-        </w:rPr>
-        <w:t>обно́влюючи</w:t>
-      </w:r>
-      <w:r>
-        <w:rPr>
-          <w:rFonts w:ascii="Times New Roman" w:hAnsi="Times New Roman"/>
-          <w:color w:val="000000"/>
-          <w:sz w:val="24"/>
-        </w:rPr>
-        <w:t xml:space="preserve"> нам,* по </w:t>
-      </w:r>
-      <w:r>
-        <w:rPr>
-          <w:rFonts w:ascii="Times New Roman" w:hAnsi="Times New Roman"/>
-          <w:color w:val="000000"/>
-          <w:sz w:val="24"/>
-        </w:rPr>
-        <w:t>вели́кій</w:t>
-      </w:r>
-      <w:r>
-        <w:rPr>
-          <w:rFonts w:ascii="Times New Roman" w:hAnsi="Times New Roman"/>
-          <w:color w:val="000000"/>
-          <w:sz w:val="24"/>
-        </w:rPr>
-        <w:t xml:space="preserve"> </w:t>
-      </w:r>
-      <w:r>
-        <w:rPr>
-          <w:rFonts w:ascii="Times New Roman" w:hAnsi="Times New Roman"/>
-          <w:color w:val="000000"/>
-          <w:sz w:val="24"/>
-        </w:rPr>
-        <w:t>Твої́й</w:t>
-      </w:r>
-      <w:r>
-        <w:rPr>
-          <w:rFonts w:ascii="Times New Roman" w:hAnsi="Times New Roman"/>
-          <w:color w:val="000000"/>
-          <w:sz w:val="24"/>
-        </w:rPr>
-        <w:t xml:space="preserve"> </w:t>
-      </w:r>
-      <w:r>
-        <w:rPr>
-          <w:rFonts w:ascii="Times New Roman" w:hAnsi="Times New Roman"/>
-          <w:color w:val="000000"/>
-          <w:sz w:val="24"/>
-        </w:rPr>
-        <w:t>ми́лості</w:t>
-      </w:r>
-      <w:r>
-        <w:rPr>
-          <w:rFonts w:ascii="Times New Roman" w:hAnsi="Times New Roman"/>
-          <w:color w:val="000000"/>
-          <w:sz w:val="24"/>
-        </w:rPr>
-        <w:t>.</w:t>
+        <w:t>Хоч запеча́таний був гріб,* як життя́ із гро́бу возсія́в Ти, Хри́сте Бо́же,* і, хоч за́мкнені були́ две́рі,* ученика́м предста́в єси́, як воскресі́ння всіх,* дух пра́вий че́рез них обно́влюючи нам,* по вели́кій Твої́й ми́лості.</w:t>
       </w:r>
     </w:p>
     <w:p>
@@ -4612,247 +3860,7 @@
           <w:color w:val="000000"/>
           <w:sz w:val="24"/>
         </w:rPr>
-        <w:t xml:space="preserve"> </w:t>
-      </w:r>
-      <w:r>
-        <w:rPr>
-          <w:rFonts w:ascii="Times New Roman" w:hAnsi="Times New Roman"/>
-          <w:color w:val="000000"/>
-          <w:sz w:val="24"/>
-        </w:rPr>
-        <w:t>Допитли́вою</w:t>
-      </w:r>
-      <w:r>
-        <w:rPr>
-          <w:rFonts w:ascii="Times New Roman" w:hAnsi="Times New Roman"/>
-          <w:color w:val="000000"/>
-          <w:sz w:val="24"/>
-        </w:rPr>
-        <w:t xml:space="preserve"> </w:t>
-      </w:r>
-      <w:r>
-        <w:rPr>
-          <w:rFonts w:ascii="Times New Roman" w:hAnsi="Times New Roman"/>
-          <w:color w:val="000000"/>
-          <w:sz w:val="24"/>
-        </w:rPr>
-        <w:t>десни́цею</w:t>
-      </w:r>
-      <w:r>
-        <w:rPr>
-          <w:rFonts w:ascii="Times New Roman" w:hAnsi="Times New Roman"/>
-          <w:color w:val="000000"/>
-          <w:sz w:val="24"/>
-        </w:rPr>
-        <w:t xml:space="preserve">* </w:t>
-      </w:r>
-      <w:r>
-        <w:rPr>
-          <w:rFonts w:ascii="Times New Roman" w:hAnsi="Times New Roman"/>
-          <w:color w:val="000000"/>
-          <w:sz w:val="24"/>
-        </w:rPr>
-        <w:t>життєда́йні</w:t>
-      </w:r>
-      <w:r>
-        <w:rPr>
-          <w:rFonts w:ascii="Times New Roman" w:hAnsi="Times New Roman"/>
-          <w:color w:val="000000"/>
-          <w:sz w:val="24"/>
-        </w:rPr>
-        <w:t xml:space="preserve"> Твої́ </w:t>
-      </w:r>
-      <w:r>
-        <w:rPr>
-          <w:rFonts w:ascii="Times New Roman" w:hAnsi="Times New Roman"/>
-          <w:color w:val="000000"/>
-          <w:sz w:val="24"/>
-        </w:rPr>
-        <w:t>ре́бра</w:t>
-      </w:r>
-      <w:r>
-        <w:rPr>
-          <w:rFonts w:ascii="Times New Roman" w:hAnsi="Times New Roman"/>
-          <w:color w:val="000000"/>
-          <w:sz w:val="24"/>
-        </w:rPr>
-        <w:t xml:space="preserve"> Тома́ </w:t>
-      </w:r>
-      <w:r>
-        <w:rPr>
-          <w:rFonts w:ascii="Times New Roman" w:hAnsi="Times New Roman"/>
-          <w:color w:val="000000"/>
-          <w:sz w:val="24"/>
-        </w:rPr>
-        <w:t>прові́рив</w:t>
-      </w:r>
-      <w:r>
-        <w:rPr>
-          <w:rFonts w:ascii="Times New Roman" w:hAnsi="Times New Roman"/>
-          <w:color w:val="000000"/>
-          <w:sz w:val="24"/>
-        </w:rPr>
-        <w:t xml:space="preserve">, </w:t>
-      </w:r>
-      <w:r>
-        <w:rPr>
-          <w:rFonts w:ascii="Times New Roman" w:hAnsi="Times New Roman"/>
-          <w:color w:val="000000"/>
-          <w:sz w:val="24"/>
-        </w:rPr>
-        <w:t>Хри́сте</w:t>
-      </w:r>
-      <w:r>
-        <w:rPr>
-          <w:rFonts w:ascii="Times New Roman" w:hAnsi="Times New Roman"/>
-          <w:color w:val="000000"/>
-          <w:sz w:val="24"/>
-        </w:rPr>
-        <w:t xml:space="preserve"> </w:t>
-      </w:r>
-      <w:r>
-        <w:rPr>
-          <w:rFonts w:ascii="Times New Roman" w:hAnsi="Times New Roman"/>
-          <w:color w:val="000000"/>
-          <w:sz w:val="24"/>
-        </w:rPr>
-        <w:t>Бо́же</w:t>
-      </w:r>
-      <w:r>
-        <w:rPr>
-          <w:rFonts w:ascii="Times New Roman" w:hAnsi="Times New Roman"/>
-          <w:color w:val="000000"/>
-          <w:sz w:val="24"/>
-        </w:rPr>
-        <w:t xml:space="preserve">,* бо, хоч </w:t>
-      </w:r>
-      <w:r>
-        <w:rPr>
-          <w:rFonts w:ascii="Times New Roman" w:hAnsi="Times New Roman"/>
-          <w:color w:val="000000"/>
-          <w:sz w:val="24"/>
-        </w:rPr>
-        <w:t>за́мкнені</w:t>
-      </w:r>
-      <w:r>
-        <w:rPr>
-          <w:rFonts w:ascii="Times New Roman" w:hAnsi="Times New Roman"/>
-          <w:color w:val="000000"/>
-          <w:sz w:val="24"/>
-        </w:rPr>
-        <w:t xml:space="preserve"> були́ </w:t>
-      </w:r>
-      <w:r>
-        <w:rPr>
-          <w:rFonts w:ascii="Times New Roman" w:hAnsi="Times New Roman"/>
-          <w:color w:val="000000"/>
-          <w:sz w:val="24"/>
-        </w:rPr>
-        <w:t>две́рі</w:t>
-      </w:r>
-      <w:r>
-        <w:rPr>
-          <w:rFonts w:ascii="Times New Roman" w:hAnsi="Times New Roman"/>
-          <w:color w:val="000000"/>
-          <w:sz w:val="24"/>
-        </w:rPr>
-        <w:t xml:space="preserve">, як Ти </w:t>
-      </w:r>
-      <w:r>
-        <w:rPr>
-          <w:rFonts w:ascii="Times New Roman" w:hAnsi="Times New Roman"/>
-          <w:color w:val="000000"/>
-          <w:sz w:val="24"/>
-        </w:rPr>
-        <w:t>увійшо́в</w:t>
-      </w:r>
-      <w:r>
-        <w:rPr>
-          <w:rFonts w:ascii="Times New Roman" w:hAnsi="Times New Roman"/>
-          <w:color w:val="000000"/>
-          <w:sz w:val="24"/>
-        </w:rPr>
-        <w:t xml:space="preserve">,* він із </w:t>
-      </w:r>
-      <w:r>
-        <w:rPr>
-          <w:rFonts w:ascii="Times New Roman" w:hAnsi="Times New Roman"/>
-          <w:color w:val="000000"/>
-          <w:sz w:val="24"/>
-        </w:rPr>
-        <w:t>і́ншими</w:t>
-      </w:r>
-      <w:r>
-        <w:rPr>
-          <w:rFonts w:ascii="Times New Roman" w:hAnsi="Times New Roman"/>
-          <w:color w:val="000000"/>
-          <w:sz w:val="24"/>
-        </w:rPr>
-        <w:t xml:space="preserve"> </w:t>
-      </w:r>
-      <w:r>
-        <w:rPr>
-          <w:rFonts w:ascii="Times New Roman" w:hAnsi="Times New Roman"/>
-          <w:color w:val="000000"/>
-          <w:sz w:val="24"/>
-        </w:rPr>
-        <w:t>Апо́столами</w:t>
-      </w:r>
-      <w:r>
-        <w:rPr>
-          <w:rFonts w:ascii="Times New Roman" w:hAnsi="Times New Roman"/>
-          <w:color w:val="000000"/>
-          <w:sz w:val="24"/>
-        </w:rPr>
-        <w:t xml:space="preserve"> </w:t>
-      </w:r>
-      <w:r>
-        <w:rPr>
-          <w:rFonts w:ascii="Times New Roman" w:hAnsi="Times New Roman"/>
-          <w:color w:val="000000"/>
-          <w:sz w:val="24"/>
-        </w:rPr>
-        <w:t>кли́кав</w:t>
-      </w:r>
-      <w:r>
-        <w:rPr>
-          <w:rFonts w:ascii="Times New Roman" w:hAnsi="Times New Roman"/>
-          <w:color w:val="000000"/>
-          <w:sz w:val="24"/>
-        </w:rPr>
-        <w:t xml:space="preserve"> до </w:t>
-      </w:r>
-      <w:r>
-        <w:rPr>
-          <w:rFonts w:ascii="Times New Roman" w:hAnsi="Times New Roman"/>
-          <w:color w:val="000000"/>
-          <w:sz w:val="24"/>
-        </w:rPr>
-        <w:t>Те́бе</w:t>
-      </w:r>
-      <w:r>
-        <w:rPr>
-          <w:rFonts w:ascii="Times New Roman" w:hAnsi="Times New Roman"/>
-          <w:color w:val="000000"/>
-          <w:sz w:val="24"/>
-        </w:rPr>
-        <w:t xml:space="preserve">:* </w:t>
-      </w:r>
-      <w:r>
-        <w:rPr>
-          <w:rFonts w:ascii="Times New Roman" w:hAnsi="Times New Roman"/>
-          <w:color w:val="000000"/>
-          <w:sz w:val="24"/>
-        </w:rPr>
-        <w:t>Госпо́дь</w:t>
-      </w:r>
-      <w:r>
-        <w:rPr>
-          <w:rFonts w:ascii="Times New Roman" w:hAnsi="Times New Roman"/>
-          <w:color w:val="000000"/>
-          <w:sz w:val="24"/>
-        </w:rPr>
-        <w:t xml:space="preserve"> єси́ і Бог мій.</w:t>
+        <w:t xml:space="preserve"> Допитли́вою десни́цею* життєда́йні Твої́ ре́бра Тома́ прові́рив, Хри́сте Бо́же,* бо, хоч за́мкнені були́ две́рі, як Ти увійшо́в,* він із і́ншими Апо́столами кли́кав до Те́бе:* Госпо́дь єси́ і Бог мій.</w:t>
       </w:r>
     </w:p>
     <w:p>
@@ -6676,7 +5684,293 @@
           <w:color w:val="000000"/>
           <w:sz w:val="24"/>
         </w:rPr>
-        <w:t xml:space="preserve">Хоч </w:t>
+        <w:t>Хоч запеча́таний був гріб,* як життя́ із гро́бу возсія́в Ти, Хри́сте Бо́же,* і, хоч за́мкнені були́ две́рі,* ученика́м предста́в єси́, як воскресі́ння всіх,* дух пра́вий че́рез них обно́влюючи нам,* по вели́кій Твої́й ми́лості.</w:t>
+      </w:r>
+    </w:p>
+    <w:p>
+      <w:pPr>
+        <w:spacing w:line="240" w:lineRule="auto"/>
+        <w:rPr>
+          <w:rFonts w:ascii="Times New Roman" w:hAnsi="Times New Roman"/>
+          <w:sz w:val="24"/>
+        </w:rPr>
+      </w:pPr>
+      <w:r>
+        <w:rPr>
+          <w:rFonts w:ascii="Times New Roman" w:hAnsi="Times New Roman"/>
+          <w:sz w:val="24"/>
+        </w:rPr>
+        <w:t>І нині, і повсякчас, і на віки вічні. Амінь.</w:t>
+      </w:r>
+    </w:p>
+    <w:p>
+      <w:pPr>
+        <w:spacing w:line="240" w:lineRule="auto"/>
+        <w:rPr>
+          <w:rFonts w:ascii="Times New Roman" w:hAnsi="Times New Roman"/>
+          <w:sz w:val="24"/>
+        </w:rPr>
+      </w:pPr>
+      <w:r>
+        <w:rPr>
+          <w:rFonts w:ascii="Times New Roman" w:hAnsi="Times New Roman"/>
+          <w:sz w:val="24"/>
+        </w:rPr>
+        <w:t>Тому, що не маємо сміливости задля великих гріхів наших,* ти, Богородице Діво, Народженого від тебе благай,* бо вельми могутня молитва Матері до милосердя Владики.* Не погордуй благаннями грішних, Всечиста,* бо милостивий і спасти може той,* хто й страждати за нас ізволив.</w:t>
+      </w:r>
+    </w:p>
+    <w:p>
+      <w:pPr>
+        <w:spacing w:line="240" w:lineRule="auto"/>
+        <w:jc w:val="center"/>
+        <w:rPr>
+          <w:rFonts w:ascii="Times New Roman" w:hAnsi="Times New Roman"/>
+          <w:i/>
+          <w:color w:val="FF0000"/>
+          <w:sz w:val="24"/>
+        </w:rPr>
+      </w:pPr>
+      <w:r>
+        <w:rPr>
+          <w:rFonts w:ascii="Times New Roman" w:hAnsi="Times New Roman"/>
+          <w:i/>
+          <w:color w:val="FF0000"/>
+          <w:sz w:val="24"/>
+        </w:rPr>
+        <w:t>*****</w:t>
+      </w:r>
+    </w:p>
+    <w:p>
+      <w:pPr>
+        <w:spacing w:line="240" w:lineRule="auto"/>
+        <w:rPr>
+          <w:rFonts w:ascii="Times New Roman" w:hAnsi="Times New Roman"/>
+          <w:sz w:val="24"/>
+        </w:rPr>
+      </w:pPr>
+      <w:r>
+        <w:rPr>
+          <w:rFonts w:ascii="Times New Roman" w:hAnsi="Times New Roman"/>
+          <w:sz w:val="24"/>
+        </w:rPr>
+        <w:t>Негайно пошли нам щедроти твої, Господи,* бо зубожіли дуже ми.* Поможи нам, Боже, Спасителю наш,* задля слави імени твого. Господи, визволь нас* і очисти гріхи наші задля імени твого.</w:t>
+      </w:r>
+      <w:r>
+        <w:rPr>
+          <w:rFonts w:ascii="Times New Roman" w:hAnsi="Times New Roman"/>
+          <w:i/>
+          <w:color w:val="FF0000"/>
+          <w:sz w:val="24"/>
+        </w:rPr>
+        <w:t xml:space="preserve"> (Пс. 78:8-9)</w:t>
+      </w:r>
+    </w:p>
+    <w:p>
+      <w:pPr>
+        <w:spacing w:line="240" w:lineRule="auto"/>
+        <w:jc w:val="center"/>
+        <w:rPr>
+          <w:rFonts w:ascii="Times New Roman" w:hAnsi="Times New Roman"/>
+          <w:sz w:val="24"/>
+        </w:rPr>
+      </w:pPr>
+      <w:r>
+        <w:rPr>
+          <w:rFonts w:ascii="Times New Roman" w:hAnsi="Times New Roman"/>
+          <w:i/>
+          <w:color w:val="FF0000"/>
+          <w:sz w:val="24"/>
+        </w:rPr>
+        <w:t>*****</w:t>
+      </w:r>
+    </w:p>
+    <w:p>
+      <w:pPr>
+        <w:spacing w:line="240" w:lineRule="auto"/>
+        <w:rPr>
+          <w:rFonts w:ascii="Times New Roman" w:hAnsi="Times New Roman"/>
+          <w:sz w:val="24"/>
+        </w:rPr>
+      </w:pPr>
+      <w:r>
+        <w:rPr>
+          <w:rFonts w:ascii="Times New Roman" w:hAnsi="Times New Roman"/>
+          <w:sz w:val="24"/>
+        </w:rPr>
+        <w:t xml:space="preserve">Святий Боже, святий Кріпкий, святий Безсмертний, помилуй нас </w:t>
+      </w:r>
+      <w:r>
+        <w:rPr>
+          <w:rFonts w:ascii="Times New Roman" w:hAnsi="Times New Roman"/>
+          <w:i/>
+          <w:color w:val="FF0000"/>
+          <w:sz w:val="24"/>
+        </w:rPr>
+        <w:t>(3 р.)</w:t>
+      </w:r>
+      <w:r>
+        <w:rPr>
+          <w:rFonts w:ascii="Times New Roman" w:hAnsi="Times New Roman"/>
+          <w:sz w:val="24"/>
+        </w:rPr>
+        <w:t>.</w:t>
+      </w:r>
+    </w:p>
+    <w:p>
+      <w:pPr>
+        <w:spacing w:line="240" w:lineRule="auto"/>
+        <w:rPr>
+          <w:rFonts w:ascii="Times New Roman" w:hAnsi="Times New Roman"/>
+          <w:sz w:val="24"/>
+        </w:rPr>
+      </w:pPr>
+      <w:r>
+        <w:rPr>
+          <w:rFonts w:ascii="Times New Roman" w:hAnsi="Times New Roman"/>
+          <w:sz w:val="24"/>
+        </w:rPr>
+        <w:t>Слава Отцю, і Сину, і Святому Духові,* і нині, і повсякчас, і на віки вічні. Амінь.</w:t>
+      </w:r>
+    </w:p>
+    <w:p>
+      <w:pPr>
+        <w:spacing w:line="240" w:lineRule="auto"/>
+        <w:rPr>
+          <w:rFonts w:ascii="Times New Roman" w:hAnsi="Times New Roman"/>
+          <w:sz w:val="24"/>
+        </w:rPr>
+      </w:pPr>
+      <w:r>
+        <w:rPr>
+          <w:rFonts w:ascii="Times New Roman" w:hAnsi="Times New Roman"/>
+          <w:sz w:val="24"/>
+        </w:rPr>
+        <w:t>Пресвята Тройце, помилуй нас;* Господи, очисти гріхи наші;* Владико, прости беззаконня наші;* Святий, завітай і зціли немочі наші імени твого ради.</w:t>
+      </w:r>
+    </w:p>
+    <w:p>
+      <w:pPr>
+        <w:spacing w:line="240" w:lineRule="auto"/>
+        <w:rPr>
+          <w:rFonts w:ascii="Times New Roman" w:hAnsi="Times New Roman"/>
+          <w:sz w:val="24"/>
+        </w:rPr>
+      </w:pPr>
+      <w:r>
+        <w:rPr>
+          <w:rFonts w:ascii="Times New Roman" w:hAnsi="Times New Roman"/>
+          <w:sz w:val="24"/>
+        </w:rPr>
+        <w:t xml:space="preserve">Господи, помилуй </w:t>
+      </w:r>
+      <w:r>
+        <w:rPr>
+          <w:rFonts w:ascii="Times New Roman" w:hAnsi="Times New Roman"/>
+          <w:i/>
+          <w:color w:val="FF0000"/>
+          <w:sz w:val="24"/>
+        </w:rPr>
+        <w:t>(3 р.)</w:t>
+      </w:r>
+      <w:r>
+        <w:rPr>
+          <w:rFonts w:ascii="Times New Roman" w:hAnsi="Times New Roman"/>
+          <w:sz w:val="24"/>
+        </w:rPr>
+        <w:t>.</w:t>
+      </w:r>
+    </w:p>
+    <w:p>
+      <w:pPr>
+        <w:spacing w:line="240" w:lineRule="auto"/>
+        <w:rPr>
+          <w:rFonts w:ascii="Times New Roman" w:hAnsi="Times New Roman"/>
+          <w:sz w:val="24"/>
+        </w:rPr>
+      </w:pPr>
+      <w:r>
+        <w:rPr>
+          <w:rFonts w:ascii="Times New Roman" w:hAnsi="Times New Roman"/>
+          <w:sz w:val="24"/>
+        </w:rPr>
+        <w:t>Слава Отцю, і Сину, і Святому Духові,* і нині, і повсякчас, і на віки вічні. Амінь.</w:t>
+      </w:r>
+    </w:p>
+    <w:p>
+      <w:pPr>
+        <w:spacing w:line="240" w:lineRule="auto"/>
+        <w:rPr>
+          <w:rFonts w:ascii="Times New Roman" w:hAnsi="Times New Roman"/>
+          <w:sz w:val="24"/>
+        </w:rPr>
+      </w:pPr>
+      <w:r>
+        <w:rPr>
+          <w:rFonts w:ascii="Times New Roman" w:hAnsi="Times New Roman"/>
+          <w:sz w:val="24"/>
+        </w:rPr>
+        <w:t>Отче наш, що єси на небесах,* нехай святиться ім’я твоє,* нехай прийде царство твоє,* нехай буде воля твоя, як на небі, так і на землі.* Хліб наш насущний дай нам сьогодні,* і прости нам провини наші,* як і ми прощаємо винуватцям нашим,* і не введи нас у спокусу,* але визволи нас від лукавого.</w:t>
+      </w:r>
+    </w:p>
+    <w:p>
+      <w:pPr>
+        <w:spacing w:line="240" w:lineRule="auto"/>
+        <w:rPr>
+          <w:rFonts w:ascii="Times New Roman" w:hAnsi="Times New Roman"/>
+          <w:sz w:val="24"/>
+        </w:rPr>
+      </w:pPr>
+      <w:r>
+        <w:rPr>
+          <w:rFonts w:ascii="Times New Roman" w:hAnsi="Times New Roman"/>
+          <w:i/>
+          <w:color w:val="FF0000"/>
+          <w:sz w:val="24"/>
+        </w:rPr>
+        <w:t xml:space="preserve">Священик: </w:t>
+      </w:r>
+      <w:r>
+        <w:rPr>
+          <w:rFonts w:ascii="Times New Roman" w:hAnsi="Times New Roman"/>
+          <w:sz w:val="24"/>
+        </w:rPr>
+        <w:t>Бо твоє є царство, і сила, і слава, Отця, і Сина, і Святого Духа, нині і повсякчас, і на віки вічні.</w:t>
+      </w:r>
+    </w:p>
+    <w:p>
+      <w:pPr>
+        <w:spacing w:line="240" w:lineRule="auto"/>
+        <w:rPr>
+          <w:rFonts w:ascii="Times New Roman" w:hAnsi="Times New Roman"/>
+          <w:sz w:val="24"/>
+        </w:rPr>
+      </w:pPr>
+      <w:r>
+        <w:rPr>
+          <w:rFonts w:ascii="Times New Roman" w:hAnsi="Times New Roman"/>
+          <w:i/>
+          <w:color w:val="FF0000"/>
+          <w:sz w:val="24"/>
+        </w:rPr>
+        <w:t xml:space="preserve">Вірні: </w:t>
+      </w:r>
+      <w:r>
+        <w:rPr>
+          <w:rFonts w:ascii="Times New Roman" w:hAnsi="Times New Roman"/>
+          <w:sz w:val="24"/>
+        </w:rPr>
+        <w:t>Амінь.</w:t>
+      </w:r>
+    </w:p>
+    <w:p>
+      <w:r>
+        <w:rPr>
+          <w:rFonts w:ascii="Times New Roman" w:hAnsi="Times New Roman"/>
+          <w:i/>
+          <w:color w:val="FF4400"/>
+          <w:sz w:val="24"/>
+        </w:rPr>
+        <w:t>Кондак (г. 8):</w:t>
       </w:r>
       <w:r>
         <w:rPr>
@@ -6684,789 +5978,7 @@
           <w:color w:val="000000"/>
           <w:sz w:val="24"/>
         </w:rPr>
-        <w:t>запеча́таний</w:t>
-      </w:r>
-      <w:r>
-        <w:rPr>
-          <w:rFonts w:ascii="Times New Roman" w:hAnsi="Times New Roman"/>
-          <w:color w:val="000000"/>
-          <w:sz w:val="24"/>
-        </w:rPr>
-        <w:t xml:space="preserve"> був гріб,* як життя́ із </w:t>
-      </w:r>
-      <w:r>
-        <w:rPr>
-          <w:rFonts w:ascii="Times New Roman" w:hAnsi="Times New Roman"/>
-          <w:color w:val="000000"/>
-          <w:sz w:val="24"/>
-        </w:rPr>
-        <w:t>гро́бу</w:t>
-      </w:r>
-      <w:r>
-        <w:rPr>
-          <w:rFonts w:ascii="Times New Roman" w:hAnsi="Times New Roman"/>
-          <w:color w:val="000000"/>
-          <w:sz w:val="24"/>
-        </w:rPr>
-        <w:t xml:space="preserve"> </w:t>
-      </w:r>
-      <w:r>
-        <w:rPr>
-          <w:rFonts w:ascii="Times New Roman" w:hAnsi="Times New Roman"/>
-          <w:color w:val="000000"/>
-          <w:sz w:val="24"/>
-        </w:rPr>
-        <w:t>возсія́в</w:t>
-      </w:r>
-      <w:r>
-        <w:rPr>
-          <w:rFonts w:ascii="Times New Roman" w:hAnsi="Times New Roman"/>
-          <w:color w:val="000000"/>
-          <w:sz w:val="24"/>
-        </w:rPr>
-        <w:t xml:space="preserve"> Ти, </w:t>
-      </w:r>
-      <w:r>
-        <w:rPr>
-          <w:rFonts w:ascii="Times New Roman" w:hAnsi="Times New Roman"/>
-          <w:color w:val="000000"/>
-          <w:sz w:val="24"/>
-        </w:rPr>
-        <w:t>Хри́сте</w:t>
-      </w:r>
-      <w:r>
-        <w:rPr>
-          <w:rFonts w:ascii="Times New Roman" w:hAnsi="Times New Roman"/>
-          <w:color w:val="000000"/>
-          <w:sz w:val="24"/>
-        </w:rPr>
-        <w:t xml:space="preserve"> </w:t>
-      </w:r>
-      <w:r>
-        <w:rPr>
-          <w:rFonts w:ascii="Times New Roman" w:hAnsi="Times New Roman"/>
-          <w:color w:val="000000"/>
-          <w:sz w:val="24"/>
-        </w:rPr>
-        <w:t>Бо́же</w:t>
-      </w:r>
-      <w:r>
-        <w:rPr>
-          <w:rFonts w:ascii="Times New Roman" w:hAnsi="Times New Roman"/>
-          <w:color w:val="000000"/>
-          <w:sz w:val="24"/>
-        </w:rPr>
-        <w:t xml:space="preserve">,* і, хоч </w:t>
-      </w:r>
-      <w:r>
-        <w:rPr>
-          <w:rFonts w:ascii="Times New Roman" w:hAnsi="Times New Roman"/>
-          <w:color w:val="000000"/>
-          <w:sz w:val="24"/>
-        </w:rPr>
-        <w:t>за́мкнені</w:t>
-      </w:r>
-      <w:r>
-        <w:rPr>
-          <w:rFonts w:ascii="Times New Roman" w:hAnsi="Times New Roman"/>
-          <w:color w:val="000000"/>
-          <w:sz w:val="24"/>
-        </w:rPr>
-        <w:t xml:space="preserve"> були́ </w:t>
-      </w:r>
-      <w:r>
-        <w:rPr>
-          <w:rFonts w:ascii="Times New Roman" w:hAnsi="Times New Roman"/>
-          <w:color w:val="000000"/>
-          <w:sz w:val="24"/>
-        </w:rPr>
-        <w:t>две́рі</w:t>
-      </w:r>
-      <w:r>
-        <w:rPr>
-          <w:rFonts w:ascii="Times New Roman" w:hAnsi="Times New Roman"/>
-          <w:color w:val="000000"/>
-          <w:sz w:val="24"/>
-        </w:rPr>
-        <w:t xml:space="preserve">,* </w:t>
-      </w:r>
-      <w:r>
-        <w:rPr>
-          <w:rFonts w:ascii="Times New Roman" w:hAnsi="Times New Roman"/>
-          <w:color w:val="000000"/>
-          <w:sz w:val="24"/>
-        </w:rPr>
-        <w:t>ученика́м</w:t>
-      </w:r>
-      <w:r>
-        <w:rPr>
-          <w:rFonts w:ascii="Times New Roman" w:hAnsi="Times New Roman"/>
-          <w:color w:val="000000"/>
-          <w:sz w:val="24"/>
-        </w:rPr>
-        <w:t xml:space="preserve"> </w:t>
-      </w:r>
-      <w:r>
-        <w:rPr>
-          <w:rFonts w:ascii="Times New Roman" w:hAnsi="Times New Roman"/>
-          <w:color w:val="000000"/>
-          <w:sz w:val="24"/>
-        </w:rPr>
-        <w:t>предста́в</w:t>
-      </w:r>
-      <w:r>
-        <w:rPr>
-          <w:rFonts w:ascii="Times New Roman" w:hAnsi="Times New Roman"/>
-          <w:color w:val="000000"/>
-          <w:sz w:val="24"/>
-        </w:rPr>
-        <w:t xml:space="preserve"> єси́, як </w:t>
-      </w:r>
-      <w:r>
-        <w:rPr>
-          <w:rFonts w:ascii="Times New Roman" w:hAnsi="Times New Roman"/>
-          <w:color w:val="000000"/>
-          <w:sz w:val="24"/>
-        </w:rPr>
-        <w:t>воскресі́ння</w:t>
-      </w:r>
-      <w:r>
-        <w:rPr>
-          <w:rFonts w:ascii="Times New Roman" w:hAnsi="Times New Roman"/>
-          <w:color w:val="000000"/>
-          <w:sz w:val="24"/>
-        </w:rPr>
-        <w:t xml:space="preserve"> всіх,* дух </w:t>
-      </w:r>
-      <w:r>
-        <w:rPr>
-          <w:rFonts w:ascii="Times New Roman" w:hAnsi="Times New Roman"/>
-          <w:color w:val="000000"/>
-          <w:sz w:val="24"/>
-        </w:rPr>
-        <w:t>пра́вий</w:t>
-      </w:r>
-      <w:r>
-        <w:rPr>
-          <w:rFonts w:ascii="Times New Roman" w:hAnsi="Times New Roman"/>
-          <w:color w:val="000000"/>
-          <w:sz w:val="24"/>
-        </w:rPr>
-        <w:t xml:space="preserve"> </w:t>
-      </w:r>
-      <w:r>
-        <w:rPr>
-          <w:rFonts w:ascii="Times New Roman" w:hAnsi="Times New Roman"/>
-          <w:color w:val="000000"/>
-          <w:sz w:val="24"/>
-        </w:rPr>
-        <w:t>че́рез</w:t>
-      </w:r>
-      <w:r>
-        <w:rPr>
-          <w:rFonts w:ascii="Times New Roman" w:hAnsi="Times New Roman"/>
-          <w:color w:val="000000"/>
-          <w:sz w:val="24"/>
-        </w:rPr>
-        <w:t xml:space="preserve"> них </w:t>
-      </w:r>
-      <w:r>
-        <w:rPr>
-          <w:rFonts w:ascii="Times New Roman" w:hAnsi="Times New Roman"/>
-          <w:color w:val="000000"/>
-          <w:sz w:val="24"/>
-        </w:rPr>
-        <w:t>обно́влюючи</w:t>
-      </w:r>
-      <w:r>
-        <w:rPr>
-          <w:rFonts w:ascii="Times New Roman" w:hAnsi="Times New Roman"/>
-          <w:color w:val="000000"/>
-          <w:sz w:val="24"/>
-        </w:rPr>
-        <w:t xml:space="preserve"> нам,* по </w:t>
-      </w:r>
-      <w:r>
-        <w:rPr>
-          <w:rFonts w:ascii="Times New Roman" w:hAnsi="Times New Roman"/>
-          <w:color w:val="000000"/>
-          <w:sz w:val="24"/>
-        </w:rPr>
-        <w:t>вели́кій</w:t>
-      </w:r>
-      <w:r>
-        <w:rPr>
-          <w:rFonts w:ascii="Times New Roman" w:hAnsi="Times New Roman"/>
-          <w:color w:val="000000"/>
-          <w:sz w:val="24"/>
-        </w:rPr>
-        <w:t xml:space="preserve"> </w:t>
-      </w:r>
-      <w:r>
-        <w:rPr>
-          <w:rFonts w:ascii="Times New Roman" w:hAnsi="Times New Roman"/>
-          <w:color w:val="000000"/>
-          <w:sz w:val="24"/>
-        </w:rPr>
-        <w:t>Твої́й</w:t>
-      </w:r>
-      <w:r>
-        <w:rPr>
-          <w:rFonts w:ascii="Times New Roman" w:hAnsi="Times New Roman"/>
-          <w:color w:val="000000"/>
-          <w:sz w:val="24"/>
-        </w:rPr>
-        <w:t xml:space="preserve"> </w:t>
-      </w:r>
-      <w:r>
-        <w:rPr>
-          <w:rFonts w:ascii="Times New Roman" w:hAnsi="Times New Roman"/>
-          <w:color w:val="000000"/>
-          <w:sz w:val="24"/>
-        </w:rPr>
-        <w:t>ми́лості</w:t>
-      </w:r>
-      <w:r>
-        <w:rPr>
-          <w:rFonts w:ascii="Times New Roman" w:hAnsi="Times New Roman"/>
-          <w:color w:val="000000"/>
-          <w:sz w:val="24"/>
-        </w:rPr>
-        <w:t>.</w:t>
-      </w:r>
-    </w:p>
-    <w:p>
-      <w:pPr>
-        <w:spacing w:line="240" w:lineRule="auto"/>
-        <w:rPr>
-          <w:rFonts w:ascii="Times New Roman" w:hAnsi="Times New Roman"/>
-          <w:sz w:val="24"/>
-        </w:rPr>
-      </w:pPr>
-      <w:r>
-        <w:rPr>
-          <w:rFonts w:ascii="Times New Roman" w:hAnsi="Times New Roman"/>
-          <w:sz w:val="24"/>
-        </w:rPr>
-        <w:t>І нині, і повсякчас, і на віки вічні. Амінь.</w:t>
-      </w:r>
-    </w:p>
-    <w:p>
-      <w:pPr>
-        <w:spacing w:line="240" w:lineRule="auto"/>
-        <w:rPr>
-          <w:rFonts w:ascii="Times New Roman" w:hAnsi="Times New Roman"/>
-          <w:sz w:val="24"/>
-        </w:rPr>
-      </w:pPr>
-      <w:r>
-        <w:rPr>
-          <w:rFonts w:ascii="Times New Roman" w:hAnsi="Times New Roman"/>
-          <w:sz w:val="24"/>
-        </w:rPr>
-        <w:t>Тому, що не маємо сміливости задля великих гріхів наших,* ти, Богородице Діво, Народженого від тебе благай,* бо вельми могутня молитва Матері до милосердя Владики.* Не погордуй благаннями грішних, Всечиста,* бо милостивий і спасти може той,* хто й страждати за нас ізволив.</w:t>
-      </w:r>
-    </w:p>
-    <w:p>
-      <w:pPr>
-        <w:spacing w:line="240" w:lineRule="auto"/>
-        <w:jc w:val="center"/>
-        <w:rPr>
-          <w:rFonts w:ascii="Times New Roman" w:hAnsi="Times New Roman"/>
-          <w:i/>
-          <w:color w:val="FF0000"/>
-          <w:sz w:val="24"/>
-        </w:rPr>
-      </w:pPr>
-      <w:r>
-        <w:rPr>
-          <w:rFonts w:ascii="Times New Roman" w:hAnsi="Times New Roman"/>
-          <w:i/>
-          <w:color w:val="FF0000"/>
-          <w:sz w:val="24"/>
-        </w:rPr>
-        <w:t>*****</w:t>
-      </w:r>
-    </w:p>
-    <w:p>
-      <w:pPr>
-        <w:spacing w:line="240" w:lineRule="auto"/>
-        <w:rPr>
-          <w:rFonts w:ascii="Times New Roman" w:hAnsi="Times New Roman"/>
-          <w:sz w:val="24"/>
-        </w:rPr>
-      </w:pPr>
-      <w:r>
-        <w:rPr>
-          <w:rFonts w:ascii="Times New Roman" w:hAnsi="Times New Roman"/>
-          <w:sz w:val="24"/>
-        </w:rPr>
-        <w:t>Негайно пошли нам щедроти твої, Господи,* бо зубожіли дуже ми.* Поможи нам, Боже, Спасителю наш,* задля слави імени твого. Господи, визволь нас* і очисти гріхи наші задля імени твого.</w:t>
-      </w:r>
-      <w:r>
-        <w:rPr>
-          <w:rFonts w:ascii="Times New Roman" w:hAnsi="Times New Roman"/>
-          <w:i/>
-          <w:color w:val="FF0000"/>
-          <w:sz w:val="24"/>
-        </w:rPr>
-        <w:t xml:space="preserve"> (Пс. 78:8-9)</w:t>
-      </w:r>
-    </w:p>
-    <w:p>
-      <w:pPr>
-        <w:spacing w:line="240" w:lineRule="auto"/>
-        <w:jc w:val="center"/>
-        <w:rPr>
-          <w:rFonts w:ascii="Times New Roman" w:hAnsi="Times New Roman"/>
-          <w:sz w:val="24"/>
-        </w:rPr>
-      </w:pPr>
-      <w:r>
-        <w:rPr>
-          <w:rFonts w:ascii="Times New Roman" w:hAnsi="Times New Roman"/>
-          <w:i/>
-          <w:color w:val="FF0000"/>
-          <w:sz w:val="24"/>
-        </w:rPr>
-        <w:t>*****</w:t>
-      </w:r>
-    </w:p>
-    <w:p>
-      <w:pPr>
-        <w:spacing w:line="240" w:lineRule="auto"/>
-        <w:rPr>
-          <w:rFonts w:ascii="Times New Roman" w:hAnsi="Times New Roman"/>
-          <w:sz w:val="24"/>
-        </w:rPr>
-      </w:pPr>
-      <w:r>
-        <w:rPr>
-          <w:rFonts w:ascii="Times New Roman" w:hAnsi="Times New Roman"/>
-          <w:sz w:val="24"/>
-        </w:rPr>
-        <w:t xml:space="preserve">Святий Боже, святий Кріпкий, святий Безсмертний, помилуй нас </w:t>
-      </w:r>
-      <w:r>
-        <w:rPr>
-          <w:rFonts w:ascii="Times New Roman" w:hAnsi="Times New Roman"/>
-          <w:i/>
-          <w:color w:val="FF0000"/>
-          <w:sz w:val="24"/>
-        </w:rPr>
-        <w:t>(3 р.)</w:t>
-      </w:r>
-      <w:r>
-        <w:rPr>
-          <w:rFonts w:ascii="Times New Roman" w:hAnsi="Times New Roman"/>
-          <w:sz w:val="24"/>
-        </w:rPr>
-        <w:t>.</w:t>
-      </w:r>
-    </w:p>
-    <w:p>
-      <w:pPr>
-        <w:spacing w:line="240" w:lineRule="auto"/>
-        <w:rPr>
-          <w:rFonts w:ascii="Times New Roman" w:hAnsi="Times New Roman"/>
-          <w:sz w:val="24"/>
-        </w:rPr>
-      </w:pPr>
-      <w:r>
-        <w:rPr>
-          <w:rFonts w:ascii="Times New Roman" w:hAnsi="Times New Roman"/>
-          <w:sz w:val="24"/>
-        </w:rPr>
-        <w:t>Слава Отцю, і Сину, і Святому Духові,* і нині, і повсякчас, і на віки вічні. Амінь.</w:t>
-      </w:r>
-    </w:p>
-    <w:p>
-      <w:pPr>
-        <w:spacing w:line="240" w:lineRule="auto"/>
-        <w:rPr>
-          <w:rFonts w:ascii="Times New Roman" w:hAnsi="Times New Roman"/>
-          <w:sz w:val="24"/>
-        </w:rPr>
-      </w:pPr>
-      <w:r>
-        <w:rPr>
-          <w:rFonts w:ascii="Times New Roman" w:hAnsi="Times New Roman"/>
-          <w:sz w:val="24"/>
-        </w:rPr>
-        <w:t>Пресвята Тройце, помилуй нас;* Господи, очисти гріхи наші;* Владико, прости беззаконня наші;* Святий, завітай і зціли немочі наші імени твого ради.</w:t>
-      </w:r>
-    </w:p>
-    <w:p>
-      <w:pPr>
-        <w:spacing w:line="240" w:lineRule="auto"/>
-        <w:rPr>
-          <w:rFonts w:ascii="Times New Roman" w:hAnsi="Times New Roman"/>
-          <w:sz w:val="24"/>
-        </w:rPr>
-      </w:pPr>
-      <w:r>
-        <w:rPr>
-          <w:rFonts w:ascii="Times New Roman" w:hAnsi="Times New Roman"/>
-          <w:sz w:val="24"/>
-        </w:rPr>
-        <w:t xml:space="preserve">Господи, помилуй </w:t>
-      </w:r>
-      <w:r>
-        <w:rPr>
-          <w:rFonts w:ascii="Times New Roman" w:hAnsi="Times New Roman"/>
-          <w:i/>
-          <w:color w:val="FF0000"/>
-          <w:sz w:val="24"/>
-        </w:rPr>
-        <w:t>(3 р.)</w:t>
-      </w:r>
-      <w:r>
-        <w:rPr>
-          <w:rFonts w:ascii="Times New Roman" w:hAnsi="Times New Roman"/>
-          <w:sz w:val="24"/>
-        </w:rPr>
-        <w:t>.</w:t>
-      </w:r>
-    </w:p>
-    <w:p>
-      <w:pPr>
-        <w:spacing w:line="240" w:lineRule="auto"/>
-        <w:rPr>
-          <w:rFonts w:ascii="Times New Roman" w:hAnsi="Times New Roman"/>
-          <w:sz w:val="24"/>
-        </w:rPr>
-      </w:pPr>
-      <w:r>
-        <w:rPr>
-          <w:rFonts w:ascii="Times New Roman" w:hAnsi="Times New Roman"/>
-          <w:sz w:val="24"/>
-        </w:rPr>
-        <w:t>Слава Отцю, і Сину, і Святому Духові,* і нині, і повсякчас, і на віки вічні. Амінь.</w:t>
-      </w:r>
-    </w:p>
-    <w:p>
-      <w:pPr>
-        <w:spacing w:line="240" w:lineRule="auto"/>
-        <w:rPr>
-          <w:rFonts w:ascii="Times New Roman" w:hAnsi="Times New Roman"/>
-          <w:sz w:val="24"/>
-        </w:rPr>
-      </w:pPr>
-      <w:r>
-        <w:rPr>
-          <w:rFonts w:ascii="Times New Roman" w:hAnsi="Times New Roman"/>
-          <w:sz w:val="24"/>
-        </w:rPr>
-        <w:t>Отче наш, що єси на небесах,* нехай святиться ім’я твоє,* нехай прийде царство твоє,* нехай буде воля твоя, як на небі, так і на землі.* Хліб наш насущний дай нам сьогодні,* і прости нам провини наші,* як і ми прощаємо винуватцям нашим,* і не введи нас у спокусу,* але визволи нас від лукавого.</w:t>
-      </w:r>
-    </w:p>
-    <w:p>
-      <w:pPr>
-        <w:spacing w:line="240" w:lineRule="auto"/>
-        <w:rPr>
-          <w:rFonts w:ascii="Times New Roman" w:hAnsi="Times New Roman"/>
-          <w:sz w:val="24"/>
-        </w:rPr>
-      </w:pPr>
-      <w:r>
-        <w:rPr>
-          <w:rFonts w:ascii="Times New Roman" w:hAnsi="Times New Roman"/>
-          <w:i/>
-          <w:color w:val="FF0000"/>
-          <w:sz w:val="24"/>
-        </w:rPr>
-        <w:t xml:space="preserve">Священик: </w:t>
-      </w:r>
-      <w:r>
-        <w:rPr>
-          <w:rFonts w:ascii="Times New Roman" w:hAnsi="Times New Roman"/>
-          <w:sz w:val="24"/>
-        </w:rPr>
-        <w:t>Бо твоє є царство, і сила, і слава, Отця, і Сина, і Святого Духа, нині і повсякчас, і на віки вічні.</w:t>
-      </w:r>
-    </w:p>
-    <w:p>
-      <w:pPr>
-        <w:spacing w:line="240" w:lineRule="auto"/>
-        <w:rPr>
-          <w:rFonts w:ascii="Times New Roman" w:hAnsi="Times New Roman"/>
-          <w:sz w:val="24"/>
-        </w:rPr>
-      </w:pPr>
-      <w:r>
-        <w:rPr>
-          <w:rFonts w:ascii="Times New Roman" w:hAnsi="Times New Roman"/>
-          <w:i/>
-          <w:color w:val="FF0000"/>
-          <w:sz w:val="24"/>
-        </w:rPr>
-        <w:t xml:space="preserve">Вірні: </w:t>
-      </w:r>
-      <w:r>
-        <w:rPr>
-          <w:rFonts w:ascii="Times New Roman" w:hAnsi="Times New Roman"/>
-          <w:sz w:val="24"/>
-        </w:rPr>
-        <w:t>Амінь.</w:t>
-      </w:r>
-    </w:p>
-    <w:p>
-      <w:r>
-        <w:rPr>
-          <w:rFonts w:ascii="Times New Roman" w:hAnsi="Times New Roman"/>
-          <w:i/>
-          <w:color w:val="FF4400"/>
-          <w:sz w:val="24"/>
-        </w:rPr>
-        <w:t>Кондак (г. 8):</w:t>
-      </w:r>
-      <w:r>
-        <w:rPr>
-          <w:rFonts w:ascii="Times New Roman" w:hAnsi="Times New Roman"/>
-          <w:color w:val="000000"/>
-          <w:sz w:val="24"/>
-        </w:rPr>
-        <w:t xml:space="preserve"> </w:t>
-      </w:r>
-      <w:r>
-        <w:rPr>
-          <w:rFonts w:ascii="Times New Roman" w:hAnsi="Times New Roman"/>
-          <w:color w:val="000000"/>
-          <w:sz w:val="24"/>
-        </w:rPr>
-        <w:t>Допитли́вою</w:t>
-      </w:r>
-      <w:r>
-        <w:rPr>
-          <w:rFonts w:ascii="Times New Roman" w:hAnsi="Times New Roman"/>
-          <w:color w:val="000000"/>
-          <w:sz w:val="24"/>
-        </w:rPr>
-        <w:t xml:space="preserve"> </w:t>
-      </w:r>
-      <w:r>
-        <w:rPr>
-          <w:rFonts w:ascii="Times New Roman" w:hAnsi="Times New Roman"/>
-          <w:color w:val="000000"/>
-          <w:sz w:val="24"/>
-        </w:rPr>
-        <w:t>десни́цею</w:t>
-      </w:r>
-      <w:r>
-        <w:rPr>
-          <w:rFonts w:ascii="Times New Roman" w:hAnsi="Times New Roman"/>
-          <w:color w:val="000000"/>
-          <w:sz w:val="24"/>
-        </w:rPr>
-        <w:t xml:space="preserve">* </w:t>
-      </w:r>
-      <w:r>
-        <w:rPr>
-          <w:rFonts w:ascii="Times New Roman" w:hAnsi="Times New Roman"/>
-          <w:color w:val="000000"/>
-          <w:sz w:val="24"/>
-        </w:rPr>
-        <w:t>життєда́йні</w:t>
-      </w:r>
-      <w:r>
-        <w:rPr>
-          <w:rFonts w:ascii="Times New Roman" w:hAnsi="Times New Roman"/>
-          <w:color w:val="000000"/>
-          <w:sz w:val="24"/>
-        </w:rPr>
-        <w:t xml:space="preserve"> Твої́ </w:t>
-      </w:r>
-      <w:r>
-        <w:rPr>
-          <w:rFonts w:ascii="Times New Roman" w:hAnsi="Times New Roman"/>
-          <w:color w:val="000000"/>
-          <w:sz w:val="24"/>
-        </w:rPr>
-        <w:t>ре́бра</w:t>
-      </w:r>
-      <w:r>
-        <w:rPr>
-          <w:rFonts w:ascii="Times New Roman" w:hAnsi="Times New Roman"/>
-          <w:color w:val="000000"/>
-          <w:sz w:val="24"/>
-        </w:rPr>
-        <w:t xml:space="preserve"> Тома́ </w:t>
-      </w:r>
-      <w:r>
-        <w:rPr>
-          <w:rFonts w:ascii="Times New Roman" w:hAnsi="Times New Roman"/>
-          <w:color w:val="000000"/>
-          <w:sz w:val="24"/>
-        </w:rPr>
-        <w:t>прові́рив</w:t>
-      </w:r>
-      <w:r>
-        <w:rPr>
-          <w:rFonts w:ascii="Times New Roman" w:hAnsi="Times New Roman"/>
-          <w:color w:val="000000"/>
-          <w:sz w:val="24"/>
-        </w:rPr>
-        <w:t xml:space="preserve">, </w:t>
-      </w:r>
-      <w:r>
-        <w:rPr>
-          <w:rFonts w:ascii="Times New Roman" w:hAnsi="Times New Roman"/>
-          <w:color w:val="000000"/>
-          <w:sz w:val="24"/>
-        </w:rPr>
-        <w:t>Хри́сте</w:t>
-      </w:r>
-      <w:r>
-        <w:rPr>
-          <w:rFonts w:ascii="Times New Roman" w:hAnsi="Times New Roman"/>
-          <w:color w:val="000000"/>
-          <w:sz w:val="24"/>
-        </w:rPr>
-        <w:t xml:space="preserve"> </w:t>
-      </w:r>
-      <w:r>
-        <w:rPr>
-          <w:rFonts w:ascii="Times New Roman" w:hAnsi="Times New Roman"/>
-          <w:color w:val="000000"/>
-          <w:sz w:val="24"/>
-        </w:rPr>
-        <w:t>Бо́же</w:t>
-      </w:r>
-      <w:r>
-        <w:rPr>
-          <w:rFonts w:ascii="Times New Roman" w:hAnsi="Times New Roman"/>
-          <w:color w:val="000000"/>
-          <w:sz w:val="24"/>
-        </w:rPr>
-        <w:t xml:space="preserve">,* бо, хоч </w:t>
-      </w:r>
-      <w:r>
-        <w:rPr>
-          <w:rFonts w:ascii="Times New Roman" w:hAnsi="Times New Roman"/>
-          <w:color w:val="000000"/>
-          <w:sz w:val="24"/>
-        </w:rPr>
-        <w:t>за́мкнені</w:t>
-      </w:r>
-      <w:r>
-        <w:rPr>
-          <w:rFonts w:ascii="Times New Roman" w:hAnsi="Times New Roman"/>
-          <w:color w:val="000000"/>
-          <w:sz w:val="24"/>
-        </w:rPr>
-        <w:t xml:space="preserve"> були́ </w:t>
-      </w:r>
-      <w:r>
-        <w:rPr>
-          <w:rFonts w:ascii="Times New Roman" w:hAnsi="Times New Roman"/>
-          <w:color w:val="000000"/>
-          <w:sz w:val="24"/>
-        </w:rPr>
-        <w:t>две́рі</w:t>
-      </w:r>
-      <w:r>
-        <w:rPr>
-          <w:rFonts w:ascii="Times New Roman" w:hAnsi="Times New Roman"/>
-          <w:color w:val="000000"/>
-          <w:sz w:val="24"/>
-        </w:rPr>
-        <w:t xml:space="preserve">, як Ти </w:t>
-      </w:r>
-      <w:r>
-        <w:rPr>
-          <w:rFonts w:ascii="Times New Roman" w:hAnsi="Times New Roman"/>
-          <w:color w:val="000000"/>
-          <w:sz w:val="24"/>
-        </w:rPr>
-        <w:t>увійшо́в</w:t>
-      </w:r>
-      <w:r>
-        <w:rPr>
-          <w:rFonts w:ascii="Times New Roman" w:hAnsi="Times New Roman"/>
-          <w:color w:val="000000"/>
-          <w:sz w:val="24"/>
-        </w:rPr>
-        <w:t xml:space="preserve">,* він із </w:t>
-      </w:r>
-      <w:r>
-        <w:rPr>
-          <w:rFonts w:ascii="Times New Roman" w:hAnsi="Times New Roman"/>
-          <w:color w:val="000000"/>
-          <w:sz w:val="24"/>
-        </w:rPr>
-        <w:t>і́ншими</w:t>
-      </w:r>
-      <w:r>
-        <w:rPr>
-          <w:rFonts w:ascii="Times New Roman" w:hAnsi="Times New Roman"/>
-          <w:color w:val="000000"/>
-          <w:sz w:val="24"/>
-        </w:rPr>
-        <w:t xml:space="preserve"> </w:t>
-      </w:r>
-      <w:r>
-        <w:rPr>
-          <w:rFonts w:ascii="Times New Roman" w:hAnsi="Times New Roman"/>
-          <w:color w:val="000000"/>
-          <w:sz w:val="24"/>
-        </w:rPr>
-        <w:t>Апо́столами</w:t>
-      </w:r>
-      <w:r>
-        <w:rPr>
-          <w:rFonts w:ascii="Times New Roman" w:hAnsi="Times New Roman"/>
-          <w:color w:val="000000"/>
-          <w:sz w:val="24"/>
-        </w:rPr>
-        <w:t xml:space="preserve"> </w:t>
-      </w:r>
-      <w:r>
-        <w:rPr>
-          <w:rFonts w:ascii="Times New Roman" w:hAnsi="Times New Roman"/>
-          <w:color w:val="000000"/>
-          <w:sz w:val="24"/>
-        </w:rPr>
-        <w:t>кли́кав</w:t>
-      </w:r>
-      <w:r>
-        <w:rPr>
-          <w:rFonts w:ascii="Times New Roman" w:hAnsi="Times New Roman"/>
-          <w:color w:val="000000"/>
-          <w:sz w:val="24"/>
-        </w:rPr>
-        <w:t xml:space="preserve"> до </w:t>
-      </w:r>
-      <w:r>
-        <w:rPr>
-          <w:rFonts w:ascii="Times New Roman" w:hAnsi="Times New Roman"/>
-          <w:color w:val="000000"/>
-          <w:sz w:val="24"/>
-        </w:rPr>
-        <w:t>Те́бе</w:t>
-      </w:r>
-      <w:r>
-        <w:rPr>
-          <w:rFonts w:ascii="Times New Roman" w:hAnsi="Times New Roman"/>
-          <w:color w:val="000000"/>
-          <w:sz w:val="24"/>
-        </w:rPr>
-        <w:t xml:space="preserve">:* </w:t>
-      </w:r>
-      <w:r>
-        <w:rPr>
-          <w:rFonts w:ascii="Times New Roman" w:hAnsi="Times New Roman"/>
-          <w:color w:val="000000"/>
-          <w:sz w:val="24"/>
-        </w:rPr>
-        <w:t>Госпо́дь</w:t>
-      </w:r>
-      <w:r>
-        <w:rPr>
-          <w:rFonts w:ascii="Times New Roman" w:hAnsi="Times New Roman"/>
-          <w:color w:val="000000"/>
-          <w:sz w:val="24"/>
-        </w:rPr>
-        <w:t xml:space="preserve"> єси́ і Бог мій.</w:t>
+        <w:t xml:space="preserve"> Допитли́вою десни́цею* життєда́йні Твої́ ре́бра Тома́ прові́рив, Хри́сте Бо́же,* бо, хоч за́мкнені були́ две́рі, як Ти увійшо́в,* він із і́ншими Апо́столами кли́кав до Те́бе:* Госпо́дь єси́ і Бог мій.</w:t>
       </w:r>
     </w:p>
     <w:p>
@@ -9220,7 +7732,304 @@
           <w:color w:val="000000"/>
           <w:sz w:val="24"/>
         </w:rPr>
-        <w:t xml:space="preserve">Хоч </w:t>
+        <w:t>Хоч запеча́таний був гріб,* як життя́ із гро́бу возсія́в Ти, Хри́сте Бо́же,* і, хоч за́мкнені були́ две́рі,* ученика́м предста́в єси́, як воскресі́ння всіх,* дух пра́вий че́рез них обно́влюючи нам,* по вели́кій Твої́й ми́лості.</w:t>
+      </w:r>
+    </w:p>
+    <w:p>
+      <w:pPr>
+        <w:spacing w:line="240" w:lineRule="auto"/>
+        <w:rPr>
+          <w:rFonts w:ascii="Times New Roman" w:hAnsi="Times New Roman"/>
+          <w:b/>
+          <w:sz w:val="24"/>
+        </w:rPr>
+      </w:pPr>
+      <w:r>
+        <w:rPr>
+          <w:rFonts w:ascii="Times New Roman" w:hAnsi="Times New Roman"/>
+          <w:sz w:val="24"/>
+        </w:rPr>
+        <w:t>І нині, і повсякчас, і на віки вічні. Амінь.</w:t>
+      </w:r>
+      <w:r>
+        <w:rPr>
+          <w:rFonts w:ascii="Times New Roman" w:hAnsi="Times New Roman"/>
+          <w:b/>
+          <w:sz w:val="24"/>
+        </w:rPr>
+        <w:t xml:space="preserve"> </w:t>
+      </w:r>
+    </w:p>
+    <w:p>
+      <w:pPr>
+        <w:spacing w:line="240" w:lineRule="auto"/>
+        <w:rPr>
+          <w:rFonts w:ascii="Times New Roman" w:hAnsi="Times New Roman"/>
+          <w:sz w:val="24"/>
+        </w:rPr>
+      </w:pPr>
+      <w:r>
+        <w:rPr>
+          <w:rFonts w:ascii="Times New Roman" w:hAnsi="Times New Roman"/>
+          <w:sz w:val="24"/>
+        </w:rPr>
+        <w:t>Ти, Милосердний, що задля нас народився з Діви,* витерпів розп'яття і смертю смерть подолав,* і, як Бог, появив воскресіння,* не погорди тими, що їх ти створив рукою своєю.* Покажи, Милостивий, своє чоловіколюбство,* прийми Богородицю, що тебе породила і молиться за нас,* і спаси, Спасе наш, людей зневірених.</w:t>
+      </w:r>
+    </w:p>
+    <w:p>
+      <w:pPr>
+        <w:spacing w:line="240" w:lineRule="auto"/>
+        <w:jc w:val="center"/>
+        <w:rPr>
+          <w:rFonts w:ascii="Times New Roman" w:hAnsi="Times New Roman"/>
+          <w:i/>
+          <w:color w:val="FF0000"/>
+          <w:sz w:val="24"/>
+        </w:rPr>
+      </w:pPr>
+      <w:r>
+        <w:rPr>
+          <w:rFonts w:ascii="Times New Roman" w:hAnsi="Times New Roman"/>
+          <w:i/>
+          <w:color w:val="FF0000"/>
+          <w:sz w:val="24"/>
+        </w:rPr>
+        <w:t>*****</w:t>
+      </w:r>
+    </w:p>
+    <w:p>
+      <w:pPr>
+        <w:spacing w:line="240" w:lineRule="auto"/>
+        <w:rPr>
+          <w:rFonts w:ascii="Times New Roman" w:hAnsi="Times New Roman"/>
+          <w:sz w:val="24"/>
+        </w:rPr>
+      </w:pPr>
+      <w:r>
+        <w:rPr>
+          <w:rFonts w:ascii="Times New Roman" w:hAnsi="Times New Roman"/>
+          <w:sz w:val="24"/>
+        </w:rPr>
+        <w:t xml:space="preserve">Не залиши нас до кінця, ради імени твого святого,* не зруйнуй заповіту твого* й не віддаляй милости твоєї від нас задля улюбленого тобою Авраама,* і задля Ісаака, раба твого,* та Ізраїля святого твого. </w:t>
+      </w:r>
+      <w:r>
+        <w:rPr>
+          <w:rFonts w:ascii="Times New Roman" w:hAnsi="Times New Roman"/>
+          <w:i/>
+          <w:color w:val="FF0000"/>
+          <w:sz w:val="24"/>
+        </w:rPr>
+        <w:t>(Дан. 3:34-35)</w:t>
+      </w:r>
+    </w:p>
+    <w:p>
+      <w:pPr>
+        <w:spacing w:line="240" w:lineRule="auto"/>
+        <w:jc w:val="center"/>
+        <w:rPr>
+          <w:rFonts w:ascii="Times New Roman" w:hAnsi="Times New Roman"/>
+          <w:i/>
+          <w:color w:val="FF0000"/>
+          <w:sz w:val="24"/>
+        </w:rPr>
+      </w:pPr>
+      <w:r>
+        <w:rPr>
+          <w:rFonts w:ascii="Times New Roman" w:hAnsi="Times New Roman"/>
+          <w:i/>
+          <w:color w:val="FF0000"/>
+          <w:sz w:val="24"/>
+        </w:rPr>
+        <w:t>*****</w:t>
+      </w:r>
+    </w:p>
+    <w:p>
+      <w:pPr>
+        <w:spacing w:line="240" w:lineRule="auto"/>
+        <w:rPr>
+          <w:rFonts w:ascii="Times New Roman" w:hAnsi="Times New Roman"/>
+          <w:sz w:val="24"/>
+        </w:rPr>
+      </w:pPr>
+      <w:r>
+        <w:rPr>
+          <w:rFonts w:ascii="Times New Roman" w:hAnsi="Times New Roman"/>
+          <w:sz w:val="24"/>
+        </w:rPr>
+        <w:t xml:space="preserve">Святий Боже, святий Кріпкий, святий Безсмертний, помилуй нас </w:t>
+      </w:r>
+      <w:r>
+        <w:rPr>
+          <w:rFonts w:ascii="Times New Roman" w:hAnsi="Times New Roman"/>
+          <w:i/>
+          <w:color w:val="FF0000"/>
+          <w:sz w:val="24"/>
+        </w:rPr>
+        <w:t>(3 р.)</w:t>
+      </w:r>
+      <w:r>
+        <w:rPr>
+          <w:rFonts w:ascii="Times New Roman" w:hAnsi="Times New Roman"/>
+          <w:sz w:val="24"/>
+        </w:rPr>
+        <w:t>.</w:t>
+      </w:r>
+    </w:p>
+    <w:p>
+      <w:pPr>
+        <w:spacing w:line="240" w:lineRule="auto"/>
+        <w:rPr>
+          <w:rFonts w:ascii="Times New Roman" w:hAnsi="Times New Roman"/>
+          <w:sz w:val="24"/>
+        </w:rPr>
+      </w:pPr>
+      <w:r>
+        <w:rPr>
+          <w:rFonts w:ascii="Times New Roman" w:hAnsi="Times New Roman"/>
+          <w:sz w:val="24"/>
+        </w:rPr>
+        <w:t>Слава Отцю, і Сину, і Святому Духові,* і нині, і повсякчас, і на віки вічні. Амінь.</w:t>
+      </w:r>
+    </w:p>
+    <w:p>
+      <w:pPr>
+        <w:spacing w:line="240" w:lineRule="auto"/>
+        <w:rPr>
+          <w:rFonts w:ascii="Times New Roman" w:hAnsi="Times New Roman"/>
+          <w:sz w:val="24"/>
+        </w:rPr>
+      </w:pPr>
+      <w:r>
+        <w:rPr>
+          <w:rFonts w:ascii="Times New Roman" w:hAnsi="Times New Roman"/>
+          <w:sz w:val="24"/>
+        </w:rPr>
+        <w:t>Пресвята Тройце, помилуй нас;* Господи, очисти гріхи наші;* Владико, прости беззаконня наші;* Святий, завітай і зціли немочі наші імени твого ради.</w:t>
+      </w:r>
+    </w:p>
+    <w:p>
+      <w:pPr>
+        <w:spacing w:line="240" w:lineRule="auto"/>
+        <w:rPr>
+          <w:rFonts w:ascii="Times New Roman" w:hAnsi="Times New Roman"/>
+          <w:sz w:val="24"/>
+        </w:rPr>
+      </w:pPr>
+      <w:r>
+        <w:rPr>
+          <w:rFonts w:ascii="Times New Roman" w:hAnsi="Times New Roman"/>
+          <w:sz w:val="24"/>
+        </w:rPr>
+        <w:t xml:space="preserve">Господи, помилуй </w:t>
+      </w:r>
+      <w:r>
+        <w:rPr>
+          <w:rFonts w:ascii="Times New Roman" w:hAnsi="Times New Roman"/>
+          <w:i/>
+          <w:color w:val="FF0000"/>
+          <w:sz w:val="24"/>
+        </w:rPr>
+        <w:t>(3 р.)</w:t>
+      </w:r>
+      <w:r>
+        <w:rPr>
+          <w:rFonts w:ascii="Times New Roman" w:hAnsi="Times New Roman"/>
+          <w:sz w:val="24"/>
+        </w:rPr>
+        <w:t>.</w:t>
+      </w:r>
+    </w:p>
+    <w:p>
+      <w:pPr>
+        <w:spacing w:line="240" w:lineRule="auto"/>
+        <w:rPr>
+          <w:rFonts w:ascii="Times New Roman" w:hAnsi="Times New Roman"/>
+          <w:sz w:val="24"/>
+        </w:rPr>
+      </w:pPr>
+      <w:r>
+        <w:rPr>
+          <w:rFonts w:ascii="Times New Roman" w:hAnsi="Times New Roman"/>
+          <w:sz w:val="24"/>
+        </w:rPr>
+        <w:t>Слава Отцю, і Сину, і Святому Духові,* і нині, і повсякчас, і на віки вічні. Амінь.</w:t>
+      </w:r>
+    </w:p>
+    <w:p>
+      <w:pPr>
+        <w:spacing w:line="240" w:lineRule="auto"/>
+        <w:rPr>
+          <w:rFonts w:ascii="Times New Roman" w:hAnsi="Times New Roman"/>
+          <w:sz w:val="24"/>
+        </w:rPr>
+      </w:pPr>
+      <w:r>
+        <w:rPr>
+          <w:rFonts w:ascii="Times New Roman" w:hAnsi="Times New Roman"/>
+          <w:sz w:val="24"/>
+        </w:rPr>
+        <w:t>Отче наш, що єси на небесах,* нехай святиться ім’я твоє,* нехай прийде царство твоє,* нехай буде воля твоя, як на небі, так і на землі.* Хліб наш насущний дай нам сьогодні,* і прости нам провини наші,* як і ми прощаємо винуватцям нашим,* і не введи нас у спокусу,* але визволи нас від лукавого.</w:t>
+      </w:r>
+    </w:p>
+    <w:p>
+      <w:pPr>
+        <w:spacing w:line="240" w:lineRule="auto"/>
+        <w:rPr>
+          <w:rFonts w:ascii="Times New Roman" w:hAnsi="Times New Roman"/>
+          <w:sz w:val="24"/>
+        </w:rPr>
+      </w:pPr>
+      <w:r>
+        <w:rPr>
+          <w:rFonts w:ascii="Times New Roman" w:hAnsi="Times New Roman"/>
+          <w:i/>
+          <w:color w:val="FF0000"/>
+          <w:sz w:val="24"/>
+        </w:rPr>
+        <w:t xml:space="preserve">Священик: </w:t>
+      </w:r>
+      <w:r>
+        <w:rPr>
+          <w:rFonts w:ascii="Times New Roman" w:hAnsi="Times New Roman"/>
+          <w:sz w:val="24"/>
+        </w:rPr>
+        <w:t>Бо твоє є царство, і сила, і слава, Отця, і Сина, і Святого Духа, нині і повсякчас, і на віки вічні.</w:t>
+      </w:r>
+    </w:p>
+    <w:p>
+      <w:pPr>
+        <w:spacing w:line="240" w:lineRule="auto"/>
+        <w:rPr>
+          <w:rFonts w:ascii="Times New Roman" w:hAnsi="Times New Roman"/>
+          <w:sz w:val="24"/>
+        </w:rPr>
+      </w:pPr>
+      <w:r>
+        <w:rPr>
+          <w:rFonts w:ascii="Times New Roman" w:hAnsi="Times New Roman"/>
+          <w:i/>
+          <w:color w:val="FF0000"/>
+          <w:sz w:val="24"/>
+        </w:rPr>
+        <w:t xml:space="preserve">Вірні: </w:t>
+      </w:r>
+      <w:r>
+        <w:rPr>
+          <w:rFonts w:ascii="Times New Roman" w:hAnsi="Times New Roman"/>
+          <w:sz w:val="24"/>
+        </w:rPr>
+        <w:t>Амінь.</w:t>
+      </w:r>
+    </w:p>
+    <w:p>
+      <w:r>
+        <w:rPr>
+          <w:rFonts w:ascii="Times New Roman" w:hAnsi="Times New Roman"/>
+          <w:i/>
+          <w:color w:val="FF4400"/>
+          <w:sz w:val="24"/>
+        </w:rPr>
+        <w:t>Кондак (г. 8):</w:t>
       </w:r>
       <w:r>
         <w:rPr>
@@ -9228,800 +8037,7 @@
           <w:color w:val="000000"/>
           <w:sz w:val="24"/>
         </w:rPr>
-        <w:t>запеча́таний</w:t>
-      </w:r>
-      <w:r>
-        <w:rPr>
-          <w:rFonts w:ascii="Times New Roman" w:hAnsi="Times New Roman"/>
-          <w:color w:val="000000"/>
-          <w:sz w:val="24"/>
-        </w:rPr>
-        <w:t xml:space="preserve"> був гріб,* як життя́ із </w:t>
-      </w:r>
-      <w:r>
-        <w:rPr>
-          <w:rFonts w:ascii="Times New Roman" w:hAnsi="Times New Roman"/>
-          <w:color w:val="000000"/>
-          <w:sz w:val="24"/>
-        </w:rPr>
-        <w:t>гро́бу</w:t>
-      </w:r>
-      <w:r>
-        <w:rPr>
-          <w:rFonts w:ascii="Times New Roman" w:hAnsi="Times New Roman"/>
-          <w:color w:val="000000"/>
-          <w:sz w:val="24"/>
-        </w:rPr>
-        <w:t xml:space="preserve"> </w:t>
-      </w:r>
-      <w:r>
-        <w:rPr>
-          <w:rFonts w:ascii="Times New Roman" w:hAnsi="Times New Roman"/>
-          <w:color w:val="000000"/>
-          <w:sz w:val="24"/>
-        </w:rPr>
-        <w:t>возсія́в</w:t>
-      </w:r>
-      <w:r>
-        <w:rPr>
-          <w:rFonts w:ascii="Times New Roman" w:hAnsi="Times New Roman"/>
-          <w:color w:val="000000"/>
-          <w:sz w:val="24"/>
-        </w:rPr>
-        <w:t xml:space="preserve"> Ти, </w:t>
-      </w:r>
-      <w:r>
-        <w:rPr>
-          <w:rFonts w:ascii="Times New Roman" w:hAnsi="Times New Roman"/>
-          <w:color w:val="000000"/>
-          <w:sz w:val="24"/>
-        </w:rPr>
-        <w:t>Хри́сте</w:t>
-      </w:r>
-      <w:r>
-        <w:rPr>
-          <w:rFonts w:ascii="Times New Roman" w:hAnsi="Times New Roman"/>
-          <w:color w:val="000000"/>
-          <w:sz w:val="24"/>
-        </w:rPr>
-        <w:t xml:space="preserve"> </w:t>
-      </w:r>
-      <w:r>
-        <w:rPr>
-          <w:rFonts w:ascii="Times New Roman" w:hAnsi="Times New Roman"/>
-          <w:color w:val="000000"/>
-          <w:sz w:val="24"/>
-        </w:rPr>
-        <w:t>Бо́же</w:t>
-      </w:r>
-      <w:r>
-        <w:rPr>
-          <w:rFonts w:ascii="Times New Roman" w:hAnsi="Times New Roman"/>
-          <w:color w:val="000000"/>
-          <w:sz w:val="24"/>
-        </w:rPr>
-        <w:t xml:space="preserve">,* і, хоч </w:t>
-      </w:r>
-      <w:r>
-        <w:rPr>
-          <w:rFonts w:ascii="Times New Roman" w:hAnsi="Times New Roman"/>
-          <w:color w:val="000000"/>
-          <w:sz w:val="24"/>
-        </w:rPr>
-        <w:t>за́мкнені</w:t>
-      </w:r>
-      <w:r>
-        <w:rPr>
-          <w:rFonts w:ascii="Times New Roman" w:hAnsi="Times New Roman"/>
-          <w:color w:val="000000"/>
-          <w:sz w:val="24"/>
-        </w:rPr>
-        <w:t xml:space="preserve"> були́ </w:t>
-      </w:r>
-      <w:r>
-        <w:rPr>
-          <w:rFonts w:ascii="Times New Roman" w:hAnsi="Times New Roman"/>
-          <w:color w:val="000000"/>
-          <w:sz w:val="24"/>
-        </w:rPr>
-        <w:t>две́рі</w:t>
-      </w:r>
-      <w:r>
-        <w:rPr>
-          <w:rFonts w:ascii="Times New Roman" w:hAnsi="Times New Roman"/>
-          <w:color w:val="000000"/>
-          <w:sz w:val="24"/>
-        </w:rPr>
-        <w:t xml:space="preserve">,* </w:t>
-      </w:r>
-      <w:r>
-        <w:rPr>
-          <w:rFonts w:ascii="Times New Roman" w:hAnsi="Times New Roman"/>
-          <w:color w:val="000000"/>
-          <w:sz w:val="24"/>
-        </w:rPr>
-        <w:t>ученика́м</w:t>
-      </w:r>
-      <w:r>
-        <w:rPr>
-          <w:rFonts w:ascii="Times New Roman" w:hAnsi="Times New Roman"/>
-          <w:color w:val="000000"/>
-          <w:sz w:val="24"/>
-        </w:rPr>
-        <w:t xml:space="preserve"> </w:t>
-      </w:r>
-      <w:r>
-        <w:rPr>
-          <w:rFonts w:ascii="Times New Roman" w:hAnsi="Times New Roman"/>
-          <w:color w:val="000000"/>
-          <w:sz w:val="24"/>
-        </w:rPr>
-        <w:t>предста́в</w:t>
-      </w:r>
-      <w:r>
-        <w:rPr>
-          <w:rFonts w:ascii="Times New Roman" w:hAnsi="Times New Roman"/>
-          <w:color w:val="000000"/>
-          <w:sz w:val="24"/>
-        </w:rPr>
-        <w:t xml:space="preserve"> єси́, як </w:t>
-      </w:r>
-      <w:r>
-        <w:rPr>
-          <w:rFonts w:ascii="Times New Roman" w:hAnsi="Times New Roman"/>
-          <w:color w:val="000000"/>
-          <w:sz w:val="24"/>
-        </w:rPr>
-        <w:t>воскресі́ння</w:t>
-      </w:r>
-      <w:r>
-        <w:rPr>
-          <w:rFonts w:ascii="Times New Roman" w:hAnsi="Times New Roman"/>
-          <w:color w:val="000000"/>
-          <w:sz w:val="24"/>
-        </w:rPr>
-        <w:t xml:space="preserve"> всіх,* дух </w:t>
-      </w:r>
-      <w:r>
-        <w:rPr>
-          <w:rFonts w:ascii="Times New Roman" w:hAnsi="Times New Roman"/>
-          <w:color w:val="000000"/>
-          <w:sz w:val="24"/>
-        </w:rPr>
-        <w:t>пра́вий</w:t>
-      </w:r>
-      <w:r>
-        <w:rPr>
-          <w:rFonts w:ascii="Times New Roman" w:hAnsi="Times New Roman"/>
-          <w:color w:val="000000"/>
-          <w:sz w:val="24"/>
-        </w:rPr>
-        <w:t xml:space="preserve"> </w:t>
-      </w:r>
-      <w:r>
-        <w:rPr>
-          <w:rFonts w:ascii="Times New Roman" w:hAnsi="Times New Roman"/>
-          <w:color w:val="000000"/>
-          <w:sz w:val="24"/>
-        </w:rPr>
-        <w:t>че́рез</w:t>
-      </w:r>
-      <w:r>
-        <w:rPr>
-          <w:rFonts w:ascii="Times New Roman" w:hAnsi="Times New Roman"/>
-          <w:color w:val="000000"/>
-          <w:sz w:val="24"/>
-        </w:rPr>
-        <w:t xml:space="preserve"> них </w:t>
-      </w:r>
-      <w:r>
-        <w:rPr>
-          <w:rFonts w:ascii="Times New Roman" w:hAnsi="Times New Roman"/>
-          <w:color w:val="000000"/>
-          <w:sz w:val="24"/>
-        </w:rPr>
-        <w:t>обно́влюючи</w:t>
-      </w:r>
-      <w:r>
-        <w:rPr>
-          <w:rFonts w:ascii="Times New Roman" w:hAnsi="Times New Roman"/>
-          <w:color w:val="000000"/>
-          <w:sz w:val="24"/>
-        </w:rPr>
-        <w:t xml:space="preserve"> нам,* по </w:t>
-      </w:r>
-      <w:r>
-        <w:rPr>
-          <w:rFonts w:ascii="Times New Roman" w:hAnsi="Times New Roman"/>
-          <w:color w:val="000000"/>
-          <w:sz w:val="24"/>
-        </w:rPr>
-        <w:t>вели́кій</w:t>
-      </w:r>
-      <w:r>
-        <w:rPr>
-          <w:rFonts w:ascii="Times New Roman" w:hAnsi="Times New Roman"/>
-          <w:color w:val="000000"/>
-          <w:sz w:val="24"/>
-        </w:rPr>
-        <w:t xml:space="preserve"> </w:t>
-      </w:r>
-      <w:r>
-        <w:rPr>
-          <w:rFonts w:ascii="Times New Roman" w:hAnsi="Times New Roman"/>
-          <w:color w:val="000000"/>
-          <w:sz w:val="24"/>
-        </w:rPr>
-        <w:t>Твої́й</w:t>
-      </w:r>
-      <w:r>
-        <w:rPr>
-          <w:rFonts w:ascii="Times New Roman" w:hAnsi="Times New Roman"/>
-          <w:color w:val="000000"/>
-          <w:sz w:val="24"/>
-        </w:rPr>
-        <w:t xml:space="preserve"> </w:t>
-      </w:r>
-      <w:r>
-        <w:rPr>
-          <w:rFonts w:ascii="Times New Roman" w:hAnsi="Times New Roman"/>
-          <w:color w:val="000000"/>
-          <w:sz w:val="24"/>
-        </w:rPr>
-        <w:t>ми́лості</w:t>
-      </w:r>
-      <w:r>
-        <w:rPr>
-          <w:rFonts w:ascii="Times New Roman" w:hAnsi="Times New Roman"/>
-          <w:color w:val="000000"/>
-          <w:sz w:val="24"/>
-        </w:rPr>
-        <w:t>.</w:t>
-      </w:r>
-    </w:p>
-    <w:p>
-      <w:pPr>
-        <w:spacing w:line="240" w:lineRule="auto"/>
-        <w:rPr>
-          <w:rFonts w:ascii="Times New Roman" w:hAnsi="Times New Roman"/>
-          <w:b/>
-          <w:sz w:val="24"/>
-        </w:rPr>
-      </w:pPr>
-      <w:r>
-        <w:rPr>
-          <w:rFonts w:ascii="Times New Roman" w:hAnsi="Times New Roman"/>
-          <w:sz w:val="24"/>
-        </w:rPr>
-        <w:t>І нині, і повсякчас, і на віки вічні. Амінь.</w:t>
-      </w:r>
-      <w:r>
-        <w:rPr>
-          <w:rFonts w:ascii="Times New Roman" w:hAnsi="Times New Roman"/>
-          <w:b/>
-          <w:sz w:val="24"/>
-        </w:rPr>
-        <w:t xml:space="preserve"> </w:t>
-      </w:r>
-    </w:p>
-    <w:p>
-      <w:pPr>
-        <w:spacing w:line="240" w:lineRule="auto"/>
-        <w:rPr>
-          <w:rFonts w:ascii="Times New Roman" w:hAnsi="Times New Roman"/>
-          <w:sz w:val="24"/>
-        </w:rPr>
-      </w:pPr>
-      <w:r>
-        <w:rPr>
-          <w:rFonts w:ascii="Times New Roman" w:hAnsi="Times New Roman"/>
-          <w:sz w:val="24"/>
-        </w:rPr>
-        <w:t>Ти, Милосердний, що задля нас народився з Діви,* витерпів розп'яття і смертю смерть подолав,* і, як Бог, появив воскресіння,* не погорди тими, що їх ти створив рукою своєю.* Покажи, Милостивий, своє чоловіколюбство,* прийми Богородицю, що тебе породила і молиться за нас,* і спаси, Спасе наш, людей зневірених.</w:t>
-      </w:r>
-    </w:p>
-    <w:p>
-      <w:pPr>
-        <w:spacing w:line="240" w:lineRule="auto"/>
-        <w:jc w:val="center"/>
-        <w:rPr>
-          <w:rFonts w:ascii="Times New Roman" w:hAnsi="Times New Roman"/>
-          <w:i/>
-          <w:color w:val="FF0000"/>
-          <w:sz w:val="24"/>
-        </w:rPr>
-      </w:pPr>
-      <w:r>
-        <w:rPr>
-          <w:rFonts w:ascii="Times New Roman" w:hAnsi="Times New Roman"/>
-          <w:i/>
-          <w:color w:val="FF0000"/>
-          <w:sz w:val="24"/>
-        </w:rPr>
-        <w:t>*****</w:t>
-      </w:r>
-    </w:p>
-    <w:p>
-      <w:pPr>
-        <w:spacing w:line="240" w:lineRule="auto"/>
-        <w:rPr>
-          <w:rFonts w:ascii="Times New Roman" w:hAnsi="Times New Roman"/>
-          <w:sz w:val="24"/>
-        </w:rPr>
-      </w:pPr>
-      <w:r>
-        <w:rPr>
-          <w:rFonts w:ascii="Times New Roman" w:hAnsi="Times New Roman"/>
-          <w:sz w:val="24"/>
-        </w:rPr>
-        <w:t xml:space="preserve">Не залиши нас до кінця, ради імени твого святого,* не зруйнуй заповіту твого* й не віддаляй милости твоєї від нас задля улюбленого тобою Авраама,* і задля Ісаака, раба твого,* та Ізраїля святого твого. </w:t>
-      </w:r>
-      <w:r>
-        <w:rPr>
-          <w:rFonts w:ascii="Times New Roman" w:hAnsi="Times New Roman"/>
-          <w:i/>
-          <w:color w:val="FF0000"/>
-          <w:sz w:val="24"/>
-        </w:rPr>
-        <w:t>(Дан. 3:34-35)</w:t>
-      </w:r>
-    </w:p>
-    <w:p>
-      <w:pPr>
-        <w:spacing w:line="240" w:lineRule="auto"/>
-        <w:jc w:val="center"/>
-        <w:rPr>
-          <w:rFonts w:ascii="Times New Roman" w:hAnsi="Times New Roman"/>
-          <w:i/>
-          <w:color w:val="FF0000"/>
-          <w:sz w:val="24"/>
-        </w:rPr>
-      </w:pPr>
-      <w:r>
-        <w:rPr>
-          <w:rFonts w:ascii="Times New Roman" w:hAnsi="Times New Roman"/>
-          <w:i/>
-          <w:color w:val="FF0000"/>
-          <w:sz w:val="24"/>
-        </w:rPr>
-        <w:t>*****</w:t>
-      </w:r>
-    </w:p>
-    <w:p>
-      <w:pPr>
-        <w:spacing w:line="240" w:lineRule="auto"/>
-        <w:rPr>
-          <w:rFonts w:ascii="Times New Roman" w:hAnsi="Times New Roman"/>
-          <w:sz w:val="24"/>
-        </w:rPr>
-      </w:pPr>
-      <w:r>
-        <w:rPr>
-          <w:rFonts w:ascii="Times New Roman" w:hAnsi="Times New Roman"/>
-          <w:sz w:val="24"/>
-        </w:rPr>
-        <w:t xml:space="preserve">Святий Боже, святий Кріпкий, святий Безсмертний, помилуй нас </w:t>
-      </w:r>
-      <w:r>
-        <w:rPr>
-          <w:rFonts w:ascii="Times New Roman" w:hAnsi="Times New Roman"/>
-          <w:i/>
-          <w:color w:val="FF0000"/>
-          <w:sz w:val="24"/>
-        </w:rPr>
-        <w:t>(3 р.)</w:t>
-      </w:r>
-      <w:r>
-        <w:rPr>
-          <w:rFonts w:ascii="Times New Roman" w:hAnsi="Times New Roman"/>
-          <w:sz w:val="24"/>
-        </w:rPr>
-        <w:t>.</w:t>
-      </w:r>
-    </w:p>
-    <w:p>
-      <w:pPr>
-        <w:spacing w:line="240" w:lineRule="auto"/>
-        <w:rPr>
-          <w:rFonts w:ascii="Times New Roman" w:hAnsi="Times New Roman"/>
-          <w:sz w:val="24"/>
-        </w:rPr>
-      </w:pPr>
-      <w:r>
-        <w:rPr>
-          <w:rFonts w:ascii="Times New Roman" w:hAnsi="Times New Roman"/>
-          <w:sz w:val="24"/>
-        </w:rPr>
-        <w:t>Слава Отцю, і Сину, і Святому Духові,* і нині, і повсякчас, і на віки вічні. Амінь.</w:t>
-      </w:r>
-    </w:p>
-    <w:p>
-      <w:pPr>
-        <w:spacing w:line="240" w:lineRule="auto"/>
-        <w:rPr>
-          <w:rFonts w:ascii="Times New Roman" w:hAnsi="Times New Roman"/>
-          <w:sz w:val="24"/>
-        </w:rPr>
-      </w:pPr>
-      <w:r>
-        <w:rPr>
-          <w:rFonts w:ascii="Times New Roman" w:hAnsi="Times New Roman"/>
-          <w:sz w:val="24"/>
-        </w:rPr>
-        <w:t>Пресвята Тройце, помилуй нас;* Господи, очисти гріхи наші;* Владико, прости беззаконня наші;* Святий, завітай і зціли немочі наші імени твого ради.</w:t>
-      </w:r>
-    </w:p>
-    <w:p>
-      <w:pPr>
-        <w:spacing w:line="240" w:lineRule="auto"/>
-        <w:rPr>
-          <w:rFonts w:ascii="Times New Roman" w:hAnsi="Times New Roman"/>
-          <w:sz w:val="24"/>
-        </w:rPr>
-      </w:pPr>
-      <w:r>
-        <w:rPr>
-          <w:rFonts w:ascii="Times New Roman" w:hAnsi="Times New Roman"/>
-          <w:sz w:val="24"/>
-        </w:rPr>
-        <w:t xml:space="preserve">Господи, помилуй </w:t>
-      </w:r>
-      <w:r>
-        <w:rPr>
-          <w:rFonts w:ascii="Times New Roman" w:hAnsi="Times New Roman"/>
-          <w:i/>
-          <w:color w:val="FF0000"/>
-          <w:sz w:val="24"/>
-        </w:rPr>
-        <w:t>(3 р.)</w:t>
-      </w:r>
-      <w:r>
-        <w:rPr>
-          <w:rFonts w:ascii="Times New Roman" w:hAnsi="Times New Roman"/>
-          <w:sz w:val="24"/>
-        </w:rPr>
-        <w:t>.</w:t>
-      </w:r>
-    </w:p>
-    <w:p>
-      <w:pPr>
-        <w:spacing w:line="240" w:lineRule="auto"/>
-        <w:rPr>
-          <w:rFonts w:ascii="Times New Roman" w:hAnsi="Times New Roman"/>
-          <w:sz w:val="24"/>
-        </w:rPr>
-      </w:pPr>
-      <w:r>
-        <w:rPr>
-          <w:rFonts w:ascii="Times New Roman" w:hAnsi="Times New Roman"/>
-          <w:sz w:val="24"/>
-        </w:rPr>
-        <w:t>Слава Отцю, і Сину, і Святому Духові,* і нині, і повсякчас, і на віки вічні. Амінь.</w:t>
-      </w:r>
-    </w:p>
-    <w:p>
-      <w:pPr>
-        <w:spacing w:line="240" w:lineRule="auto"/>
-        <w:rPr>
-          <w:rFonts w:ascii="Times New Roman" w:hAnsi="Times New Roman"/>
-          <w:sz w:val="24"/>
-        </w:rPr>
-      </w:pPr>
-      <w:r>
-        <w:rPr>
-          <w:rFonts w:ascii="Times New Roman" w:hAnsi="Times New Roman"/>
-          <w:sz w:val="24"/>
-        </w:rPr>
-        <w:t>Отче наш, що єси на небесах,* нехай святиться ім’я твоє,* нехай прийде царство твоє,* нехай буде воля твоя, як на небі, так і на землі.* Хліб наш насущний дай нам сьогодні,* і прости нам провини наші,* як і ми прощаємо винуватцям нашим,* і не введи нас у спокусу,* але визволи нас від лукавого.</w:t>
-      </w:r>
-    </w:p>
-    <w:p>
-      <w:pPr>
-        <w:spacing w:line="240" w:lineRule="auto"/>
-        <w:rPr>
-          <w:rFonts w:ascii="Times New Roman" w:hAnsi="Times New Roman"/>
-          <w:sz w:val="24"/>
-        </w:rPr>
-      </w:pPr>
-      <w:r>
-        <w:rPr>
-          <w:rFonts w:ascii="Times New Roman" w:hAnsi="Times New Roman"/>
-          <w:i/>
-          <w:color w:val="FF0000"/>
-          <w:sz w:val="24"/>
-        </w:rPr>
-        <w:t xml:space="preserve">Священик: </w:t>
-      </w:r>
-      <w:r>
-        <w:rPr>
-          <w:rFonts w:ascii="Times New Roman" w:hAnsi="Times New Roman"/>
-          <w:sz w:val="24"/>
-        </w:rPr>
-        <w:t>Бо твоє є царство, і сила, і слава, Отця, і Сина, і Святого Духа, нині і повсякчас, і на віки вічні.</w:t>
-      </w:r>
-    </w:p>
-    <w:p>
-      <w:pPr>
-        <w:spacing w:line="240" w:lineRule="auto"/>
-        <w:rPr>
-          <w:rFonts w:ascii="Times New Roman" w:hAnsi="Times New Roman"/>
-          <w:sz w:val="24"/>
-        </w:rPr>
-      </w:pPr>
-      <w:r>
-        <w:rPr>
-          <w:rFonts w:ascii="Times New Roman" w:hAnsi="Times New Roman"/>
-          <w:i/>
-          <w:color w:val="FF0000"/>
-          <w:sz w:val="24"/>
-        </w:rPr>
-        <w:t xml:space="preserve">Вірні: </w:t>
-      </w:r>
-      <w:r>
-        <w:rPr>
-          <w:rFonts w:ascii="Times New Roman" w:hAnsi="Times New Roman"/>
-          <w:sz w:val="24"/>
-        </w:rPr>
-        <w:t>Амінь.</w:t>
-      </w:r>
-    </w:p>
-    <w:p>
-      <w:r>
-        <w:rPr>
-          <w:rFonts w:ascii="Times New Roman" w:hAnsi="Times New Roman"/>
-          <w:i/>
-          <w:color w:val="FF4400"/>
-          <w:sz w:val="24"/>
-        </w:rPr>
-        <w:t>Кондак (г. 8):</w:t>
-      </w:r>
-      <w:r>
-        <w:rPr>
-          <w:rFonts w:ascii="Times New Roman" w:hAnsi="Times New Roman"/>
-          <w:color w:val="000000"/>
-          <w:sz w:val="24"/>
-        </w:rPr>
-        <w:t xml:space="preserve"> </w:t>
-      </w:r>
-      <w:r>
-        <w:rPr>
-          <w:rFonts w:ascii="Times New Roman" w:hAnsi="Times New Roman"/>
-          <w:color w:val="000000"/>
-          <w:sz w:val="24"/>
-        </w:rPr>
-        <w:t>Допитли́вою</w:t>
-      </w:r>
-      <w:r>
-        <w:rPr>
-          <w:rFonts w:ascii="Times New Roman" w:hAnsi="Times New Roman"/>
-          <w:color w:val="000000"/>
-          <w:sz w:val="24"/>
-        </w:rPr>
-        <w:t xml:space="preserve"> </w:t>
-      </w:r>
-      <w:r>
-        <w:rPr>
-          <w:rFonts w:ascii="Times New Roman" w:hAnsi="Times New Roman"/>
-          <w:color w:val="000000"/>
-          <w:sz w:val="24"/>
-        </w:rPr>
-        <w:t>десни́цею</w:t>
-      </w:r>
-      <w:r>
-        <w:rPr>
-          <w:rFonts w:ascii="Times New Roman" w:hAnsi="Times New Roman"/>
-          <w:color w:val="000000"/>
-          <w:sz w:val="24"/>
-        </w:rPr>
-        <w:t xml:space="preserve">* </w:t>
-      </w:r>
-      <w:r>
-        <w:rPr>
-          <w:rFonts w:ascii="Times New Roman" w:hAnsi="Times New Roman"/>
-          <w:color w:val="000000"/>
-          <w:sz w:val="24"/>
-        </w:rPr>
-        <w:t>життєда́йні</w:t>
-      </w:r>
-      <w:r>
-        <w:rPr>
-          <w:rFonts w:ascii="Times New Roman" w:hAnsi="Times New Roman"/>
-          <w:color w:val="000000"/>
-          <w:sz w:val="24"/>
-        </w:rPr>
-        <w:t xml:space="preserve"> Твої́ </w:t>
-      </w:r>
-      <w:r>
-        <w:rPr>
-          <w:rFonts w:ascii="Times New Roman" w:hAnsi="Times New Roman"/>
-          <w:color w:val="000000"/>
-          <w:sz w:val="24"/>
-        </w:rPr>
-        <w:t>ре́бра</w:t>
-      </w:r>
-      <w:r>
-        <w:rPr>
-          <w:rFonts w:ascii="Times New Roman" w:hAnsi="Times New Roman"/>
-          <w:color w:val="000000"/>
-          <w:sz w:val="24"/>
-        </w:rPr>
-        <w:t xml:space="preserve"> Тома́ </w:t>
-      </w:r>
-      <w:r>
-        <w:rPr>
-          <w:rFonts w:ascii="Times New Roman" w:hAnsi="Times New Roman"/>
-          <w:color w:val="000000"/>
-          <w:sz w:val="24"/>
-        </w:rPr>
-        <w:t>прові́рив</w:t>
-      </w:r>
-      <w:r>
-        <w:rPr>
-          <w:rFonts w:ascii="Times New Roman" w:hAnsi="Times New Roman"/>
-          <w:color w:val="000000"/>
-          <w:sz w:val="24"/>
-        </w:rPr>
-        <w:t xml:space="preserve">, </w:t>
-      </w:r>
-      <w:r>
-        <w:rPr>
-          <w:rFonts w:ascii="Times New Roman" w:hAnsi="Times New Roman"/>
-          <w:color w:val="000000"/>
-          <w:sz w:val="24"/>
-        </w:rPr>
-        <w:t>Хри́сте</w:t>
-      </w:r>
-      <w:r>
-        <w:rPr>
-          <w:rFonts w:ascii="Times New Roman" w:hAnsi="Times New Roman"/>
-          <w:color w:val="000000"/>
-          <w:sz w:val="24"/>
-        </w:rPr>
-        <w:t xml:space="preserve"> </w:t>
-      </w:r>
-      <w:r>
-        <w:rPr>
-          <w:rFonts w:ascii="Times New Roman" w:hAnsi="Times New Roman"/>
-          <w:color w:val="000000"/>
-          <w:sz w:val="24"/>
-        </w:rPr>
-        <w:t>Бо́же</w:t>
-      </w:r>
-      <w:r>
-        <w:rPr>
-          <w:rFonts w:ascii="Times New Roman" w:hAnsi="Times New Roman"/>
-          <w:color w:val="000000"/>
-          <w:sz w:val="24"/>
-        </w:rPr>
-        <w:t xml:space="preserve">,* бо, хоч </w:t>
-      </w:r>
-      <w:r>
-        <w:rPr>
-          <w:rFonts w:ascii="Times New Roman" w:hAnsi="Times New Roman"/>
-          <w:color w:val="000000"/>
-          <w:sz w:val="24"/>
-        </w:rPr>
-        <w:t>за́мкнені</w:t>
-      </w:r>
-      <w:r>
-        <w:rPr>
-          <w:rFonts w:ascii="Times New Roman" w:hAnsi="Times New Roman"/>
-          <w:color w:val="000000"/>
-          <w:sz w:val="24"/>
-        </w:rPr>
-        <w:t xml:space="preserve"> були́ </w:t>
-      </w:r>
-      <w:r>
-        <w:rPr>
-          <w:rFonts w:ascii="Times New Roman" w:hAnsi="Times New Roman"/>
-          <w:color w:val="000000"/>
-          <w:sz w:val="24"/>
-        </w:rPr>
-        <w:t>две́рі</w:t>
-      </w:r>
-      <w:r>
-        <w:rPr>
-          <w:rFonts w:ascii="Times New Roman" w:hAnsi="Times New Roman"/>
-          <w:color w:val="000000"/>
-          <w:sz w:val="24"/>
-        </w:rPr>
-        <w:t xml:space="preserve">, як Ти </w:t>
-      </w:r>
-      <w:r>
-        <w:rPr>
-          <w:rFonts w:ascii="Times New Roman" w:hAnsi="Times New Roman"/>
-          <w:color w:val="000000"/>
-          <w:sz w:val="24"/>
-        </w:rPr>
-        <w:t>увійшо́в</w:t>
-      </w:r>
-      <w:r>
-        <w:rPr>
-          <w:rFonts w:ascii="Times New Roman" w:hAnsi="Times New Roman"/>
-          <w:color w:val="000000"/>
-          <w:sz w:val="24"/>
-        </w:rPr>
-        <w:t xml:space="preserve">,* він із </w:t>
-      </w:r>
-      <w:r>
-        <w:rPr>
-          <w:rFonts w:ascii="Times New Roman" w:hAnsi="Times New Roman"/>
-          <w:color w:val="000000"/>
-          <w:sz w:val="24"/>
-        </w:rPr>
-        <w:t>і́ншими</w:t>
-      </w:r>
-      <w:r>
-        <w:rPr>
-          <w:rFonts w:ascii="Times New Roman" w:hAnsi="Times New Roman"/>
-          <w:color w:val="000000"/>
-          <w:sz w:val="24"/>
-        </w:rPr>
-        <w:t xml:space="preserve"> </w:t>
-      </w:r>
-      <w:r>
-        <w:rPr>
-          <w:rFonts w:ascii="Times New Roman" w:hAnsi="Times New Roman"/>
-          <w:color w:val="000000"/>
-          <w:sz w:val="24"/>
-        </w:rPr>
-        <w:t>Апо́столами</w:t>
-      </w:r>
-      <w:r>
-        <w:rPr>
-          <w:rFonts w:ascii="Times New Roman" w:hAnsi="Times New Roman"/>
-          <w:color w:val="000000"/>
-          <w:sz w:val="24"/>
-        </w:rPr>
-        <w:t xml:space="preserve"> </w:t>
-      </w:r>
-      <w:r>
-        <w:rPr>
-          <w:rFonts w:ascii="Times New Roman" w:hAnsi="Times New Roman"/>
-          <w:color w:val="000000"/>
-          <w:sz w:val="24"/>
-        </w:rPr>
-        <w:t>кли́кав</w:t>
-      </w:r>
-      <w:r>
-        <w:rPr>
-          <w:rFonts w:ascii="Times New Roman" w:hAnsi="Times New Roman"/>
-          <w:color w:val="000000"/>
-          <w:sz w:val="24"/>
-        </w:rPr>
-        <w:t xml:space="preserve"> до </w:t>
-      </w:r>
-      <w:r>
-        <w:rPr>
-          <w:rFonts w:ascii="Times New Roman" w:hAnsi="Times New Roman"/>
-          <w:color w:val="000000"/>
-          <w:sz w:val="24"/>
-        </w:rPr>
-        <w:t>Те́бе</w:t>
-      </w:r>
-      <w:r>
-        <w:rPr>
-          <w:rFonts w:ascii="Times New Roman" w:hAnsi="Times New Roman"/>
-          <w:color w:val="000000"/>
-          <w:sz w:val="24"/>
-        </w:rPr>
-        <w:t xml:space="preserve">:* </w:t>
-      </w:r>
-      <w:r>
-        <w:rPr>
-          <w:rFonts w:ascii="Times New Roman" w:hAnsi="Times New Roman"/>
-          <w:color w:val="000000"/>
-          <w:sz w:val="24"/>
-        </w:rPr>
-        <w:t>Госпо́дь</w:t>
-      </w:r>
-      <w:r>
-        <w:rPr>
-          <w:rFonts w:ascii="Times New Roman" w:hAnsi="Times New Roman"/>
-          <w:color w:val="000000"/>
-          <w:sz w:val="24"/>
-        </w:rPr>
-        <w:t xml:space="preserve"> єси́ і Бог мій.</w:t>
+        <w:t xml:space="preserve"> Допитли́вою десни́цею* життєда́йні Твої́ ре́бра Тома́ прові́рив, Хри́сте Бо́же,* бо, хоч за́мкнені були́ две́рі, як Ти увійшо́в,* він із і́ншими Апо́столами кли́кав до Те́бе:* Госпо́дь єси́ і Бог мій.</w:t>
       </w:r>
     </w:p>
     <w:p>

</xml_diff>